<commit_message>
feat(question 5): create stores.
</commit_message>
<xml_diff>
--- a/Questao5/Questão 5.docx
+++ b/Questao5/Questão 5.docx
@@ -6,15 +6,14 @@
       <w:pPr>
         <w:pStyle w:val="Normal"/>
         <w:rPr>
-          <w:b/>
+          <w:shd w:fill="auto" w:val="clear"/>
+        </w:rPr>
+      </w:pPr>
+      <w:r>
+        <w:rPr>
           <w:b/>
           <w:bCs/>
-        </w:rPr>
-      </w:pPr>
-      <w:r>
-        <w:rPr>
-          <w:b/>
-          <w:bCs/>
+          <w:shd w:fill="auto" w:val="clear"/>
         </w:rPr>
         <w:t>Questão 5</w:t>
       </w:r>
@@ -22,29 +21,39 @@
     <w:p>
       <w:pPr>
         <w:pStyle w:val="Normal"/>
-        <w:rPr/>
-      </w:pPr>
-      <w:r>
-        <w:rPr/>
+        <w:rPr>
+          <w:shd w:fill="auto" w:val="clear"/>
+        </w:rPr>
+      </w:pPr>
+      <w:r>
+        <w:rPr>
+          <w:shd w:fill="auto" w:val="clear"/>
+        </w:rPr>
       </w:r>
     </w:p>
     <w:p>
       <w:pPr>
         <w:pStyle w:val="Normal"/>
-        <w:rPr/>
-      </w:pPr>
-      <w:r>
-        <w:rPr/>
+        <w:rPr>
+          <w:shd w:fill="auto" w:val="clear"/>
+        </w:rPr>
+      </w:pPr>
+      <w:r>
+        <w:rPr>
+          <w:shd w:fill="auto" w:val="clear"/>
+        </w:rPr>
         <w:t xml:space="preserve">Um banco que já possui uma </w:t>
       </w:r>
       <w:r>
         <w:rPr>
-          <w:shd w:fill="FFFF00" w:val="clear"/>
+          <w:shd w:fill="auto" w:val="clear"/>
         </w:rPr>
         <w:t>API REST</w:t>
       </w:r>
       <w:r>
-        <w:rPr/>
+        <w:rPr>
+          <w:shd w:fill="auto" w:val="clear"/>
+        </w:rPr>
         <w:t>, necessita que você desenvolva duas novas funcionalidades:</w:t>
       </w:r>
     </w:p>
@@ -55,16 +64,20 @@
           <w:ilvl w:val="0"/>
           <w:numId w:val="1"/>
         </w:numPr>
-        <w:rPr/>
-      </w:pPr>
-      <w:r>
-        <w:rPr>
-          <w:shd w:fill="FFFF00" w:val="clear"/>
+        <w:rPr>
+          <w:shd w:fill="auto" w:val="clear"/>
+        </w:rPr>
+      </w:pPr>
+      <w:r>
+        <w:rPr>
+          <w:shd w:fill="auto" w:val="clear"/>
         </w:rPr>
         <w:t>Movimentação</w:t>
       </w:r>
       <w:r>
-        <w:rPr/>
+        <w:rPr>
+          <w:shd w:fill="auto" w:val="clear"/>
+        </w:rPr>
         <w:t xml:space="preserve"> de uma conta corrente;</w:t>
       </w:r>
     </w:p>
@@ -75,45 +88,61 @@
           <w:ilvl w:val="0"/>
           <w:numId w:val="1"/>
         </w:numPr>
-        <w:rPr/>
-      </w:pPr>
-      <w:r>
-        <w:rPr>
-          <w:shd w:fill="FFFF00" w:val="clear"/>
+        <w:rPr>
+          <w:shd w:fill="auto" w:val="clear"/>
+        </w:rPr>
+      </w:pPr>
+      <w:r>
+        <w:rPr>
+          <w:shd w:fill="auto" w:val="clear"/>
         </w:rPr>
         <w:t>Consulta do saldo</w:t>
       </w:r>
       <w:r>
-        <w:rPr/>
+        <w:rPr>
+          <w:shd w:fill="auto" w:val="clear"/>
+        </w:rPr>
         <w:t xml:space="preserve"> da conta corrente;</w:t>
       </w:r>
     </w:p>
     <w:p>
       <w:pPr>
         <w:pStyle w:val="Normal"/>
-        <w:rPr/>
-      </w:pPr>
-      <w:r>
-        <w:rPr/>
+        <w:rPr>
+          <w:shd w:fill="auto" w:val="clear"/>
+        </w:rPr>
+      </w:pPr>
+      <w:r>
+        <w:rPr>
+          <w:shd w:fill="auto" w:val="clear"/>
+        </w:rPr>
       </w:r>
     </w:p>
     <w:p>
       <w:pPr>
         <w:pStyle w:val="Normal"/>
-        <w:rPr/>
-      </w:pPr>
-      <w:r>
-        <w:rPr/>
+        <w:rPr>
+          <w:shd w:fill="auto" w:val="clear"/>
+        </w:rPr>
+      </w:pPr>
+      <w:r>
+        <w:rPr>
+          <w:shd w:fill="auto" w:val="clear"/>
+        </w:rPr>
         <w:t>A API do banco já está funcionando, conectada a um banco Sqlite e as tabelas já foram criadas conforme modelo ER abaixo:</w:t>
       </w:r>
     </w:p>
     <w:p>
       <w:pPr>
         <w:pStyle w:val="Normal"/>
-        <w:rPr/>
-      </w:pPr>
-      <w:r>
-        <w:rPr/>
+        <w:rPr>
+          <w:shd w:fill="auto" w:val="clear"/>
+        </w:rPr>
+      </w:pPr>
+      <w:r>
+        <w:rPr>
+          <w:shd w:fill="auto" w:val="clear"/>
+        </w:rPr>
         <w:drawing>
           <wp:inline distT="0" distB="0" distL="0" distR="0">
             <wp:extent cx="2120900" cy="1668145"/>
@@ -156,10 +185,14 @@
     <w:p>
       <w:pPr>
         <w:pStyle w:val="Normal"/>
-        <w:rPr/>
-      </w:pPr>
-      <w:r>
-        <w:rPr/>
+        <w:rPr>
+          <w:shd w:fill="auto" w:val="clear"/>
+        </w:rPr>
+      </w:pPr>
+      <w:r>
+        <w:rPr>
+          <w:shd w:fill="auto" w:val="clear"/>
+        </w:rPr>
         <w:t>Questao5\Infrastructure\Sqlite\DatabaseBootstrap.cs – Script utilizado na inicialização</w:t>
       </w:r>
     </w:p>
@@ -191,13 +224,15 @@
           <w:p>
             <w:pPr>
               <w:pStyle w:val="Normal"/>
-              <w:widowControl/>
+              <w:widowControl w:val="false"/>
+              <w:suppressAutoHyphens w:val="true"/>
               <w:spacing w:before="0" w:after="0"/>
               <w:jc w:val="left"/>
               <w:rPr>
                 <w:rFonts w:ascii="Consolas" w:hAnsi="Consolas" w:cs="Consolas"/>
                 <w:sz w:val="16"/>
                 <w:szCs w:val="16"/>
+                <w:shd w:fill="auto" w:val="clear"/>
               </w:rPr>
             </w:pPr>
             <w:r>
@@ -209,6 +244,7 @@
                 <w:kern w:val="0"/>
                 <w:sz w:val="16"/>
                 <w:szCs w:val="16"/>
+                <w:shd w:fill="auto" w:val="clear"/>
                 <w:lang w:val="pt-BR" w:eastAsia="en-US" w:bidi="ar-SA"/>
               </w:rPr>
               <w:t>CREATE</w:t>
@@ -220,6 +256,7 @@
                 <w:kern w:val="0"/>
                 <w:sz w:val="16"/>
                 <w:szCs w:val="16"/>
+                <w:shd w:fill="auto" w:val="clear"/>
                 <w:lang w:val="pt-BR" w:eastAsia="en-US" w:bidi="ar-SA"/>
               </w:rPr>
               <w:t xml:space="preserve"> </w:t>
@@ -233,6 +270,7 @@
                 <w:kern w:val="0"/>
                 <w:sz w:val="16"/>
                 <w:szCs w:val="16"/>
+                <w:shd w:fill="auto" w:val="clear"/>
                 <w:lang w:val="pt-BR" w:eastAsia="en-US" w:bidi="ar-SA"/>
               </w:rPr>
               <w:t>TABLE</w:t>
@@ -244,6 +282,7 @@
                 <w:kern w:val="0"/>
                 <w:sz w:val="16"/>
                 <w:szCs w:val="16"/>
+                <w:shd w:fill="auto" w:val="clear"/>
                 <w:lang w:val="pt-BR" w:eastAsia="en-US" w:bidi="ar-SA"/>
               </w:rPr>
               <w:t xml:space="preserve"> contacorrente (</w:t>
@@ -252,13 +291,15 @@
           <w:p>
             <w:pPr>
               <w:pStyle w:val="Normal"/>
-              <w:widowControl/>
+              <w:widowControl w:val="false"/>
+              <w:suppressAutoHyphens w:val="true"/>
               <w:spacing w:before="0" w:after="0"/>
               <w:jc w:val="left"/>
               <w:rPr>
                 <w:rFonts w:ascii="Consolas" w:hAnsi="Consolas" w:cs="Consolas"/>
                 <w:sz w:val="16"/>
                 <w:szCs w:val="16"/>
+                <w:shd w:fill="auto" w:val="clear"/>
               </w:rPr>
             </w:pPr>
             <w:r>
@@ -268,6 +309,7 @@
                 <w:kern w:val="0"/>
                 <w:sz w:val="16"/>
                 <w:szCs w:val="16"/>
+                <w:shd w:fill="auto" w:val="clear"/>
                 <w:lang w:val="pt-BR" w:eastAsia="en-US" w:bidi="ar-SA"/>
               </w:rPr>
               <w:tab/>
@@ -282,6 +324,7 @@
                 <w:kern w:val="0"/>
                 <w:sz w:val="16"/>
                 <w:szCs w:val="16"/>
+                <w:shd w:fill="auto" w:val="clear"/>
                 <w:lang w:val="pt-BR" w:eastAsia="en-US" w:bidi="ar-SA"/>
               </w:rPr>
               <w:t>TEXT</w:t>
@@ -293,6 +336,7 @@
                 <w:kern w:val="0"/>
                 <w:sz w:val="16"/>
                 <w:szCs w:val="16"/>
+                <w:shd w:fill="auto" w:val="clear"/>
                 <w:lang w:val="pt-BR" w:eastAsia="en-US" w:bidi="ar-SA"/>
               </w:rPr>
               <w:t>(</w:t>
@@ -304,6 +348,7 @@
                 <w:kern w:val="0"/>
                 <w:sz w:val="16"/>
                 <w:szCs w:val="16"/>
+                <w:shd w:fill="auto" w:val="clear"/>
                 <w:lang w:val="pt-BR" w:eastAsia="en-US" w:bidi="ar-SA"/>
               </w:rPr>
               <w:t>37</w:t>
@@ -315,6 +360,7 @@
                 <w:kern w:val="0"/>
                 <w:sz w:val="16"/>
                 <w:szCs w:val="16"/>
+                <w:shd w:fill="auto" w:val="clear"/>
                 <w:lang w:val="pt-BR" w:eastAsia="en-US" w:bidi="ar-SA"/>
               </w:rPr>
               <w:t xml:space="preserve">) </w:t>
@@ -328,6 +374,7 @@
                 <w:kern w:val="0"/>
                 <w:sz w:val="16"/>
                 <w:szCs w:val="16"/>
+                <w:shd w:fill="auto" w:val="clear"/>
                 <w:lang w:val="pt-BR" w:eastAsia="en-US" w:bidi="ar-SA"/>
               </w:rPr>
               <w:t>PRIMARY</w:t>
@@ -339,6 +386,7 @@
                 <w:kern w:val="0"/>
                 <w:sz w:val="16"/>
                 <w:szCs w:val="16"/>
+                <w:shd w:fill="auto" w:val="clear"/>
                 <w:lang w:val="pt-BR" w:eastAsia="en-US" w:bidi="ar-SA"/>
               </w:rPr>
               <w:t xml:space="preserve"> </w:t>
@@ -352,6 +400,7 @@
                 <w:kern w:val="0"/>
                 <w:sz w:val="16"/>
                 <w:szCs w:val="16"/>
+                <w:shd w:fill="auto" w:val="clear"/>
                 <w:lang w:val="pt-BR" w:eastAsia="en-US" w:bidi="ar-SA"/>
               </w:rPr>
               <w:t>KEY</w:t>
@@ -363,6 +412,7 @@
                 <w:kern w:val="0"/>
                 <w:sz w:val="16"/>
                 <w:szCs w:val="16"/>
+                <w:shd w:fill="auto" w:val="clear"/>
                 <w:lang w:val="pt-BR" w:eastAsia="en-US" w:bidi="ar-SA"/>
               </w:rPr>
               <w:t xml:space="preserve">, </w:t>
@@ -374,6 +424,7 @@
                 <w:kern w:val="0"/>
                 <w:sz w:val="16"/>
                 <w:szCs w:val="16"/>
+                <w:shd w:fill="auto" w:val="clear"/>
                 <w:lang w:val="pt-BR" w:eastAsia="en-US" w:bidi="ar-SA"/>
               </w:rPr>
               <w:t>-- id da conta corrente</w:t>
@@ -382,13 +433,15 @@
           <w:p>
             <w:pPr>
               <w:pStyle w:val="Normal"/>
-              <w:widowControl/>
+              <w:widowControl w:val="false"/>
+              <w:suppressAutoHyphens w:val="true"/>
               <w:spacing w:before="0" w:after="0"/>
               <w:jc w:val="left"/>
               <w:rPr>
                 <w:rFonts w:ascii="Consolas" w:hAnsi="Consolas" w:cs="Consolas"/>
                 <w:sz w:val="16"/>
                 <w:szCs w:val="16"/>
+                <w:shd w:fill="auto" w:val="clear"/>
               </w:rPr>
             </w:pPr>
             <w:r>
@@ -398,6 +451,7 @@
                 <w:kern w:val="0"/>
                 <w:sz w:val="16"/>
                 <w:szCs w:val="16"/>
+                <w:shd w:fill="auto" w:val="clear"/>
                 <w:lang w:val="pt-BR" w:eastAsia="en-US" w:bidi="ar-SA"/>
               </w:rPr>
               <w:tab/>
@@ -412,6 +466,7 @@
                 <w:kern w:val="0"/>
                 <w:sz w:val="16"/>
                 <w:szCs w:val="16"/>
+                <w:shd w:fill="auto" w:val="clear"/>
                 <w:lang w:val="pt-BR" w:eastAsia="en-US" w:bidi="ar-SA"/>
               </w:rPr>
               <w:t>INTEGER</w:t>
@@ -423,6 +478,7 @@
                 <w:kern w:val="0"/>
                 <w:sz w:val="16"/>
                 <w:szCs w:val="16"/>
+                <w:shd w:fill="auto" w:val="clear"/>
                 <w:lang w:val="pt-BR" w:eastAsia="en-US" w:bidi="ar-SA"/>
               </w:rPr>
               <w:t>(</w:t>
@@ -434,6 +490,7 @@
                 <w:kern w:val="0"/>
                 <w:sz w:val="16"/>
                 <w:szCs w:val="16"/>
+                <w:shd w:fill="auto" w:val="clear"/>
                 <w:lang w:val="pt-BR" w:eastAsia="en-US" w:bidi="ar-SA"/>
               </w:rPr>
               <w:t>10</w:t>
@@ -445,6 +502,7 @@
                 <w:kern w:val="0"/>
                 <w:sz w:val="16"/>
                 <w:szCs w:val="16"/>
+                <w:shd w:fill="auto" w:val="clear"/>
                 <w:lang w:val="pt-BR" w:eastAsia="en-US" w:bidi="ar-SA"/>
               </w:rPr>
               <w:t xml:space="preserve">) </w:t>
@@ -458,6 +516,7 @@
                 <w:kern w:val="0"/>
                 <w:sz w:val="16"/>
                 <w:szCs w:val="16"/>
+                <w:shd w:fill="auto" w:val="clear"/>
                 <w:lang w:val="pt-BR" w:eastAsia="en-US" w:bidi="ar-SA"/>
               </w:rPr>
               <w:t>NOT</w:t>
@@ -469,6 +528,7 @@
                 <w:kern w:val="0"/>
                 <w:sz w:val="16"/>
                 <w:szCs w:val="16"/>
+                <w:shd w:fill="auto" w:val="clear"/>
                 <w:lang w:val="pt-BR" w:eastAsia="en-US" w:bidi="ar-SA"/>
               </w:rPr>
               <w:t xml:space="preserve"> </w:t>
@@ -482,6 +542,7 @@
                 <w:kern w:val="0"/>
                 <w:sz w:val="16"/>
                 <w:szCs w:val="16"/>
+                <w:shd w:fill="auto" w:val="clear"/>
                 <w:lang w:val="pt-BR" w:eastAsia="en-US" w:bidi="ar-SA"/>
               </w:rPr>
               <w:t>NULL</w:t>
@@ -493,6 +554,7 @@
                 <w:kern w:val="0"/>
                 <w:sz w:val="16"/>
                 <w:szCs w:val="16"/>
+                <w:shd w:fill="auto" w:val="clear"/>
                 <w:lang w:val="pt-BR" w:eastAsia="en-US" w:bidi="ar-SA"/>
               </w:rPr>
               <w:t xml:space="preserve"> </w:t>
@@ -506,6 +568,7 @@
                 <w:kern w:val="0"/>
                 <w:sz w:val="16"/>
                 <w:szCs w:val="16"/>
+                <w:shd w:fill="auto" w:val="clear"/>
                 <w:lang w:val="pt-BR" w:eastAsia="en-US" w:bidi="ar-SA"/>
               </w:rPr>
               <w:t>UNIQUE</w:t>
@@ -517,6 +580,7 @@
                 <w:kern w:val="0"/>
                 <w:sz w:val="16"/>
                 <w:szCs w:val="16"/>
+                <w:shd w:fill="auto" w:val="clear"/>
                 <w:lang w:val="pt-BR" w:eastAsia="en-US" w:bidi="ar-SA"/>
               </w:rPr>
               <w:t xml:space="preserve">, </w:t>
@@ -528,6 +592,7 @@
                 <w:kern w:val="0"/>
                 <w:sz w:val="16"/>
                 <w:szCs w:val="16"/>
+                <w:shd w:fill="auto" w:val="clear"/>
                 <w:lang w:val="pt-BR" w:eastAsia="en-US" w:bidi="ar-SA"/>
               </w:rPr>
               <w:t>-- numero da conta corrente</w:t>
@@ -536,13 +601,15 @@
           <w:p>
             <w:pPr>
               <w:pStyle w:val="Normal"/>
-              <w:widowControl/>
+              <w:widowControl w:val="false"/>
+              <w:suppressAutoHyphens w:val="true"/>
               <w:spacing w:before="0" w:after="0"/>
               <w:jc w:val="left"/>
               <w:rPr>
                 <w:rFonts w:ascii="Consolas" w:hAnsi="Consolas" w:cs="Consolas"/>
                 <w:sz w:val="16"/>
                 <w:szCs w:val="16"/>
+                <w:shd w:fill="auto" w:val="clear"/>
               </w:rPr>
             </w:pPr>
             <w:r>
@@ -552,6 +619,7 @@
                 <w:kern w:val="0"/>
                 <w:sz w:val="16"/>
                 <w:szCs w:val="16"/>
+                <w:shd w:fill="auto" w:val="clear"/>
                 <w:lang w:val="pt-BR" w:eastAsia="en-US" w:bidi="ar-SA"/>
               </w:rPr>
               <w:tab/>
@@ -566,6 +634,7 @@
                 <w:kern w:val="0"/>
                 <w:sz w:val="16"/>
                 <w:szCs w:val="16"/>
+                <w:shd w:fill="auto" w:val="clear"/>
                 <w:lang w:val="pt-BR" w:eastAsia="en-US" w:bidi="ar-SA"/>
               </w:rPr>
               <w:t>TEXT</w:t>
@@ -577,6 +646,7 @@
                 <w:kern w:val="0"/>
                 <w:sz w:val="16"/>
                 <w:szCs w:val="16"/>
+                <w:shd w:fill="auto" w:val="clear"/>
                 <w:lang w:val="pt-BR" w:eastAsia="en-US" w:bidi="ar-SA"/>
               </w:rPr>
               <w:t>(</w:t>
@@ -588,6 +658,7 @@
                 <w:kern w:val="0"/>
                 <w:sz w:val="16"/>
                 <w:szCs w:val="16"/>
+                <w:shd w:fill="auto" w:val="clear"/>
                 <w:lang w:val="pt-BR" w:eastAsia="en-US" w:bidi="ar-SA"/>
               </w:rPr>
               <w:t>100</w:t>
@@ -599,6 +670,7 @@
                 <w:kern w:val="0"/>
                 <w:sz w:val="16"/>
                 <w:szCs w:val="16"/>
+                <w:shd w:fill="auto" w:val="clear"/>
                 <w:lang w:val="pt-BR" w:eastAsia="en-US" w:bidi="ar-SA"/>
               </w:rPr>
               <w:t xml:space="preserve">) </w:t>
@@ -612,6 +684,7 @@
                 <w:kern w:val="0"/>
                 <w:sz w:val="16"/>
                 <w:szCs w:val="16"/>
+                <w:shd w:fill="auto" w:val="clear"/>
                 <w:lang w:val="pt-BR" w:eastAsia="en-US" w:bidi="ar-SA"/>
               </w:rPr>
               <w:t>NOT</w:t>
@@ -623,6 +696,7 @@
                 <w:kern w:val="0"/>
                 <w:sz w:val="16"/>
                 <w:szCs w:val="16"/>
+                <w:shd w:fill="auto" w:val="clear"/>
                 <w:lang w:val="pt-BR" w:eastAsia="en-US" w:bidi="ar-SA"/>
               </w:rPr>
               <w:t xml:space="preserve"> </w:t>
@@ -636,6 +710,7 @@
                 <w:kern w:val="0"/>
                 <w:sz w:val="16"/>
                 <w:szCs w:val="16"/>
+                <w:shd w:fill="auto" w:val="clear"/>
                 <w:lang w:val="pt-BR" w:eastAsia="en-US" w:bidi="ar-SA"/>
               </w:rPr>
               <w:t>NULL</w:t>
@@ -647,6 +722,7 @@
                 <w:kern w:val="0"/>
                 <w:sz w:val="16"/>
                 <w:szCs w:val="16"/>
+                <w:shd w:fill="auto" w:val="clear"/>
                 <w:lang w:val="pt-BR" w:eastAsia="en-US" w:bidi="ar-SA"/>
               </w:rPr>
               <w:t xml:space="preserve">, </w:t>
@@ -658,6 +734,7 @@
                 <w:kern w:val="0"/>
                 <w:sz w:val="16"/>
                 <w:szCs w:val="16"/>
+                <w:shd w:fill="auto" w:val="clear"/>
                 <w:lang w:val="pt-BR" w:eastAsia="en-US" w:bidi="ar-SA"/>
               </w:rPr>
               <w:t>-- nome do titular da conta corrente</w:t>
@@ -666,13 +743,15 @@
           <w:p>
             <w:pPr>
               <w:pStyle w:val="Normal"/>
-              <w:widowControl/>
+              <w:widowControl w:val="false"/>
+              <w:suppressAutoHyphens w:val="true"/>
               <w:spacing w:before="0" w:after="0"/>
               <w:jc w:val="left"/>
               <w:rPr>
                 <w:rFonts w:ascii="Consolas" w:hAnsi="Consolas" w:cs="Consolas"/>
                 <w:sz w:val="16"/>
                 <w:szCs w:val="16"/>
+                <w:shd w:fill="auto" w:val="clear"/>
               </w:rPr>
             </w:pPr>
             <w:r>
@@ -682,6 +761,7 @@
                 <w:kern w:val="0"/>
                 <w:sz w:val="16"/>
                 <w:szCs w:val="16"/>
+                <w:shd w:fill="auto" w:val="clear"/>
                 <w:lang w:val="pt-BR" w:eastAsia="en-US" w:bidi="ar-SA"/>
               </w:rPr>
               <w:tab/>
@@ -696,6 +776,7 @@
                 <w:kern w:val="0"/>
                 <w:sz w:val="16"/>
                 <w:szCs w:val="16"/>
+                <w:shd w:fill="auto" w:val="clear"/>
                 <w:lang w:val="pt-BR" w:eastAsia="en-US" w:bidi="ar-SA"/>
               </w:rPr>
               <w:t>INTEGER</w:t>
@@ -707,6 +788,7 @@
                 <w:kern w:val="0"/>
                 <w:sz w:val="16"/>
                 <w:szCs w:val="16"/>
+                <w:shd w:fill="auto" w:val="clear"/>
                 <w:lang w:val="pt-BR" w:eastAsia="en-US" w:bidi="ar-SA"/>
               </w:rPr>
               <w:t>(</w:t>
@@ -718,6 +800,7 @@
                 <w:kern w:val="0"/>
                 <w:sz w:val="16"/>
                 <w:szCs w:val="16"/>
+                <w:shd w:fill="auto" w:val="clear"/>
                 <w:lang w:val="pt-BR" w:eastAsia="en-US" w:bidi="ar-SA"/>
               </w:rPr>
               <w:t>1</w:t>
@@ -729,6 +812,7 @@
                 <w:kern w:val="0"/>
                 <w:sz w:val="16"/>
                 <w:szCs w:val="16"/>
+                <w:shd w:fill="auto" w:val="clear"/>
                 <w:lang w:val="pt-BR" w:eastAsia="en-US" w:bidi="ar-SA"/>
               </w:rPr>
               <w:t xml:space="preserve">) </w:t>
@@ -742,6 +826,7 @@
                 <w:kern w:val="0"/>
                 <w:sz w:val="16"/>
                 <w:szCs w:val="16"/>
+                <w:shd w:fill="auto" w:val="clear"/>
                 <w:lang w:val="pt-BR" w:eastAsia="en-US" w:bidi="ar-SA"/>
               </w:rPr>
               <w:t>NOT</w:t>
@@ -753,6 +838,7 @@
                 <w:kern w:val="0"/>
                 <w:sz w:val="16"/>
                 <w:szCs w:val="16"/>
+                <w:shd w:fill="auto" w:val="clear"/>
                 <w:lang w:val="pt-BR" w:eastAsia="en-US" w:bidi="ar-SA"/>
               </w:rPr>
               <w:t xml:space="preserve"> </w:t>
@@ -766,6 +852,7 @@
                 <w:kern w:val="0"/>
                 <w:sz w:val="16"/>
                 <w:szCs w:val="16"/>
+                <w:shd w:fill="auto" w:val="clear"/>
                 <w:lang w:val="pt-BR" w:eastAsia="en-US" w:bidi="ar-SA"/>
               </w:rPr>
               <w:t>NULL</w:t>
@@ -777,6 +864,7 @@
                 <w:kern w:val="0"/>
                 <w:sz w:val="16"/>
                 <w:szCs w:val="16"/>
+                <w:shd w:fill="auto" w:val="clear"/>
                 <w:lang w:val="pt-BR" w:eastAsia="en-US" w:bidi="ar-SA"/>
               </w:rPr>
               <w:t xml:space="preserve"> </w:t>
@@ -790,6 +878,7 @@
                 <w:kern w:val="0"/>
                 <w:sz w:val="16"/>
                 <w:szCs w:val="16"/>
+                <w:shd w:fill="auto" w:val="clear"/>
                 <w:lang w:val="pt-BR" w:eastAsia="en-US" w:bidi="ar-SA"/>
               </w:rPr>
               <w:t>default</w:t>
@@ -801,6 +890,7 @@
                 <w:kern w:val="0"/>
                 <w:sz w:val="16"/>
                 <w:szCs w:val="16"/>
+                <w:shd w:fill="auto" w:val="clear"/>
                 <w:lang w:val="pt-BR" w:eastAsia="en-US" w:bidi="ar-SA"/>
               </w:rPr>
               <w:t xml:space="preserve"> </w:t>
@@ -812,6 +902,7 @@
                 <w:kern w:val="0"/>
                 <w:sz w:val="16"/>
                 <w:szCs w:val="16"/>
+                <w:shd w:fill="auto" w:val="clear"/>
                 <w:lang w:val="pt-BR" w:eastAsia="en-US" w:bidi="ar-SA"/>
               </w:rPr>
               <w:t>0</w:t>
@@ -823,6 +914,7 @@
                 <w:kern w:val="0"/>
                 <w:sz w:val="16"/>
                 <w:szCs w:val="16"/>
+                <w:shd w:fill="auto" w:val="clear"/>
                 <w:lang w:val="pt-BR" w:eastAsia="en-US" w:bidi="ar-SA"/>
               </w:rPr>
               <w:t xml:space="preserve">, </w:t>
@@ -834,6 +926,7 @@
                 <w:kern w:val="0"/>
                 <w:sz w:val="16"/>
                 <w:szCs w:val="16"/>
+                <w:shd w:fill="auto" w:val="clear"/>
                 <w:lang w:val="pt-BR" w:eastAsia="en-US" w:bidi="ar-SA"/>
               </w:rPr>
               <w:t>-- indicativo se a conta esta ativa. (0 = inativa, 1 = ativa).</w:t>
@@ -842,13 +935,15 @@
           <w:p>
             <w:pPr>
               <w:pStyle w:val="Normal"/>
-              <w:widowControl/>
+              <w:widowControl w:val="false"/>
+              <w:suppressAutoHyphens w:val="true"/>
               <w:spacing w:before="0" w:after="0"/>
               <w:jc w:val="left"/>
               <w:rPr>
                 <w:rFonts w:ascii="Consolas" w:hAnsi="Consolas" w:cs="Consolas"/>
                 <w:sz w:val="16"/>
                 <w:szCs w:val="16"/>
+                <w:shd w:fill="auto" w:val="clear"/>
               </w:rPr>
             </w:pPr>
             <w:r>
@@ -858,6 +953,7 @@
                 <w:kern w:val="0"/>
                 <w:sz w:val="16"/>
                 <w:szCs w:val="16"/>
+                <w:shd w:fill="auto" w:val="clear"/>
                 <w:lang w:val="pt-BR" w:eastAsia="en-US" w:bidi="ar-SA"/>
               </w:rPr>
               <w:tab/>
@@ -871,6 +967,7 @@
                 <w:kern w:val="0"/>
                 <w:sz w:val="16"/>
                 <w:szCs w:val="16"/>
+                <w:shd w:fill="auto" w:val="clear"/>
                 <w:lang w:val="pt-BR" w:eastAsia="en-US" w:bidi="ar-SA"/>
               </w:rPr>
               <w:t>CHECK</w:t>
@@ -882,6 +979,7 @@
                 <w:kern w:val="0"/>
                 <w:sz w:val="16"/>
                 <w:szCs w:val="16"/>
+                <w:shd w:fill="auto" w:val="clear"/>
                 <w:lang w:val="pt-BR" w:eastAsia="en-US" w:bidi="ar-SA"/>
               </w:rPr>
               <w:t xml:space="preserve"> (ativo </w:t>
@@ -895,6 +993,7 @@
                 <w:kern w:val="0"/>
                 <w:sz w:val="16"/>
                 <w:szCs w:val="16"/>
+                <w:shd w:fill="auto" w:val="clear"/>
                 <w:lang w:val="pt-BR" w:eastAsia="en-US" w:bidi="ar-SA"/>
               </w:rPr>
               <w:t>in</w:t>
@@ -906,6 +1005,7 @@
                 <w:kern w:val="0"/>
                 <w:sz w:val="16"/>
                 <w:szCs w:val="16"/>
+                <w:shd w:fill="auto" w:val="clear"/>
                 <w:lang w:val="pt-BR" w:eastAsia="en-US" w:bidi="ar-SA"/>
               </w:rPr>
               <w:t xml:space="preserve"> (</w:t>
@@ -917,6 +1017,7 @@
                 <w:kern w:val="0"/>
                 <w:sz w:val="16"/>
                 <w:szCs w:val="16"/>
+                <w:shd w:fill="auto" w:val="clear"/>
                 <w:lang w:val="pt-BR" w:eastAsia="en-US" w:bidi="ar-SA"/>
               </w:rPr>
               <w:t>0</w:t>
@@ -928,6 +1029,7 @@
                 <w:kern w:val="0"/>
                 <w:sz w:val="16"/>
                 <w:szCs w:val="16"/>
+                <w:shd w:fill="auto" w:val="clear"/>
                 <w:lang w:val="pt-BR" w:eastAsia="en-US" w:bidi="ar-SA"/>
               </w:rPr>
               <w:t>,</w:t>
@@ -939,6 +1041,7 @@
                 <w:kern w:val="0"/>
                 <w:sz w:val="16"/>
                 <w:szCs w:val="16"/>
+                <w:shd w:fill="auto" w:val="clear"/>
                 <w:lang w:val="pt-BR" w:eastAsia="en-US" w:bidi="ar-SA"/>
               </w:rPr>
               <w:t>1</w:t>
@@ -950,6 +1053,7 @@
                 <w:kern w:val="0"/>
                 <w:sz w:val="16"/>
                 <w:szCs w:val="16"/>
+                <w:shd w:fill="auto" w:val="clear"/>
                 <w:lang w:val="pt-BR" w:eastAsia="en-US" w:bidi="ar-SA"/>
               </w:rPr>
               <w:t>))</w:t>
@@ -958,13 +1062,15 @@
           <w:p>
             <w:pPr>
               <w:pStyle w:val="Normal"/>
-              <w:widowControl/>
+              <w:widowControl w:val="false"/>
+              <w:suppressAutoHyphens w:val="true"/>
               <w:spacing w:before="0" w:after="0"/>
               <w:jc w:val="left"/>
               <w:rPr>
                 <w:rFonts w:ascii="Consolas" w:hAnsi="Consolas" w:cs="Consolas"/>
                 <w:sz w:val="16"/>
                 <w:szCs w:val="16"/>
+                <w:shd w:fill="auto" w:val="clear"/>
               </w:rPr>
             </w:pPr>
             <w:r>
@@ -974,6 +1080,7 @@
                 <w:kern w:val="0"/>
                 <w:sz w:val="16"/>
                 <w:szCs w:val="16"/>
+                <w:shd w:fill="auto" w:val="clear"/>
                 <w:lang w:val="pt-BR" w:eastAsia="en-US" w:bidi="ar-SA"/>
               </w:rPr>
               <w:t>)</w:t>
@@ -985,6 +1092,7 @@
                 <w:kern w:val="0"/>
                 <w:sz w:val="16"/>
                 <w:szCs w:val="16"/>
+                <w:shd w:fill="auto" w:val="clear"/>
                 <w:lang w:val="pt-BR" w:eastAsia="en-US" w:bidi="ar-SA"/>
               </w:rPr>
               <w:t>;</w:t>
@@ -993,35 +1101,38 @@
           <w:p>
             <w:pPr>
               <w:pStyle w:val="Normal"/>
-              <w:widowControl/>
+              <w:widowControl w:val="false"/>
+              <w:suppressAutoHyphens w:val="true"/>
               <w:spacing w:before="0" w:after="0"/>
               <w:jc w:val="left"/>
               <w:rPr>
                 <w:rFonts w:ascii="Consolas" w:hAnsi="Consolas" w:cs="Consolas"/>
                 <w:sz w:val="16"/>
                 <w:szCs w:val="16"/>
+                <w:shd w:fill="auto" w:val="clear"/>
               </w:rPr>
             </w:pPr>
             <w:r>
               <w:rPr>
-                <w:rFonts w:eastAsia="Calibri" w:cs="Consolas" w:ascii="Consolas" w:hAnsi="Consolas"/>
-                <w:kern w:val="0"/>
-                <w:sz w:val="16"/>
-                <w:szCs w:val="16"/>
-                <w:lang w:val="pt-BR" w:eastAsia="en-US" w:bidi="ar-SA"/>
+                <w:rFonts w:cs="Consolas" w:ascii="Consolas" w:hAnsi="Consolas"/>
+                <w:sz w:val="16"/>
+                <w:szCs w:val="16"/>
+                <w:shd w:fill="auto" w:val="clear"/>
               </w:rPr>
             </w:r>
           </w:p>
           <w:p>
             <w:pPr>
               <w:pStyle w:val="Normal"/>
-              <w:widowControl/>
+              <w:widowControl w:val="false"/>
+              <w:suppressAutoHyphens w:val="true"/>
               <w:spacing w:before="0" w:after="0"/>
               <w:jc w:val="left"/>
               <w:rPr>
                 <w:rFonts w:ascii="Consolas" w:hAnsi="Consolas" w:cs="Consolas"/>
                 <w:sz w:val="16"/>
                 <w:szCs w:val="16"/>
+                <w:shd w:fill="auto" w:val="clear"/>
               </w:rPr>
             </w:pPr>
             <w:r>
@@ -1033,6 +1144,7 @@
                 <w:kern w:val="0"/>
                 <w:sz w:val="16"/>
                 <w:szCs w:val="16"/>
+                <w:shd w:fill="auto" w:val="clear"/>
                 <w:lang w:val="pt-BR" w:eastAsia="en-US" w:bidi="ar-SA"/>
               </w:rPr>
               <w:t>CREATE</w:t>
@@ -1044,6 +1156,7 @@
                 <w:kern w:val="0"/>
                 <w:sz w:val="16"/>
                 <w:szCs w:val="16"/>
+                <w:shd w:fill="auto" w:val="clear"/>
                 <w:lang w:val="pt-BR" w:eastAsia="en-US" w:bidi="ar-SA"/>
               </w:rPr>
               <w:t xml:space="preserve"> </w:t>
@@ -1057,6 +1170,7 @@
                 <w:kern w:val="0"/>
                 <w:sz w:val="16"/>
                 <w:szCs w:val="16"/>
+                <w:shd w:fill="auto" w:val="clear"/>
                 <w:lang w:val="pt-BR" w:eastAsia="en-US" w:bidi="ar-SA"/>
               </w:rPr>
               <w:t>TABLE</w:t>
@@ -1068,6 +1182,7 @@
                 <w:kern w:val="0"/>
                 <w:sz w:val="16"/>
                 <w:szCs w:val="16"/>
+                <w:shd w:fill="auto" w:val="clear"/>
                 <w:lang w:val="pt-BR" w:eastAsia="en-US" w:bidi="ar-SA"/>
               </w:rPr>
               <w:t xml:space="preserve"> movimento (</w:t>
@@ -1076,13 +1191,15 @@
           <w:p>
             <w:pPr>
               <w:pStyle w:val="Normal"/>
-              <w:widowControl/>
+              <w:widowControl w:val="false"/>
+              <w:suppressAutoHyphens w:val="true"/>
               <w:spacing w:before="0" w:after="0"/>
               <w:jc w:val="left"/>
               <w:rPr>
                 <w:rFonts w:ascii="Consolas" w:hAnsi="Consolas" w:cs="Consolas"/>
                 <w:sz w:val="16"/>
                 <w:szCs w:val="16"/>
+                <w:shd w:fill="auto" w:val="clear"/>
               </w:rPr>
             </w:pPr>
             <w:r>
@@ -1092,6 +1209,7 @@
                 <w:kern w:val="0"/>
                 <w:sz w:val="16"/>
                 <w:szCs w:val="16"/>
+                <w:shd w:fill="auto" w:val="clear"/>
                 <w:lang w:val="pt-BR" w:eastAsia="en-US" w:bidi="ar-SA"/>
               </w:rPr>
               <w:tab/>
@@ -1106,6 +1224,7 @@
                 <w:kern w:val="0"/>
                 <w:sz w:val="16"/>
                 <w:szCs w:val="16"/>
+                <w:shd w:fill="auto" w:val="clear"/>
                 <w:lang w:val="pt-BR" w:eastAsia="en-US" w:bidi="ar-SA"/>
               </w:rPr>
               <w:t>TEXT</w:t>
@@ -1117,6 +1236,7 @@
                 <w:kern w:val="0"/>
                 <w:sz w:val="16"/>
                 <w:szCs w:val="16"/>
+                <w:shd w:fill="auto" w:val="clear"/>
                 <w:lang w:val="pt-BR" w:eastAsia="en-US" w:bidi="ar-SA"/>
               </w:rPr>
               <w:t>(</w:t>
@@ -1128,6 +1248,7 @@
                 <w:kern w:val="0"/>
                 <w:sz w:val="16"/>
                 <w:szCs w:val="16"/>
+                <w:shd w:fill="auto" w:val="clear"/>
                 <w:lang w:val="pt-BR" w:eastAsia="en-US" w:bidi="ar-SA"/>
               </w:rPr>
               <w:t>37</w:t>
@@ -1139,6 +1260,7 @@
                 <w:kern w:val="0"/>
                 <w:sz w:val="16"/>
                 <w:szCs w:val="16"/>
+                <w:shd w:fill="auto" w:val="clear"/>
                 <w:lang w:val="pt-BR" w:eastAsia="en-US" w:bidi="ar-SA"/>
               </w:rPr>
               <w:t xml:space="preserve">) </w:t>
@@ -1152,6 +1274,7 @@
                 <w:kern w:val="0"/>
                 <w:sz w:val="16"/>
                 <w:szCs w:val="16"/>
+                <w:shd w:fill="auto" w:val="clear"/>
                 <w:lang w:val="pt-BR" w:eastAsia="en-US" w:bidi="ar-SA"/>
               </w:rPr>
               <w:t>PRIMARY</w:t>
@@ -1163,6 +1286,7 @@
                 <w:kern w:val="0"/>
                 <w:sz w:val="16"/>
                 <w:szCs w:val="16"/>
+                <w:shd w:fill="auto" w:val="clear"/>
                 <w:lang w:val="pt-BR" w:eastAsia="en-US" w:bidi="ar-SA"/>
               </w:rPr>
               <w:t xml:space="preserve"> </w:t>
@@ -1176,6 +1300,7 @@
                 <w:kern w:val="0"/>
                 <w:sz w:val="16"/>
                 <w:szCs w:val="16"/>
+                <w:shd w:fill="auto" w:val="clear"/>
                 <w:lang w:val="pt-BR" w:eastAsia="en-US" w:bidi="ar-SA"/>
               </w:rPr>
               <w:t>KEY</w:t>
@@ -1187,6 +1312,7 @@
                 <w:kern w:val="0"/>
                 <w:sz w:val="16"/>
                 <w:szCs w:val="16"/>
+                <w:shd w:fill="auto" w:val="clear"/>
                 <w:lang w:val="pt-BR" w:eastAsia="en-US" w:bidi="ar-SA"/>
               </w:rPr>
               <w:t xml:space="preserve">, </w:t>
@@ -1198,6 +1324,7 @@
                 <w:kern w:val="0"/>
                 <w:sz w:val="16"/>
                 <w:szCs w:val="16"/>
+                <w:shd w:fill="auto" w:val="clear"/>
                 <w:lang w:val="pt-BR" w:eastAsia="en-US" w:bidi="ar-SA"/>
               </w:rPr>
               <w:t>-- identificacao unica do movimento</w:t>
@@ -1206,13 +1333,15 @@
           <w:p>
             <w:pPr>
               <w:pStyle w:val="Normal"/>
-              <w:widowControl/>
+              <w:widowControl w:val="false"/>
+              <w:suppressAutoHyphens w:val="true"/>
               <w:spacing w:before="0" w:after="0"/>
               <w:jc w:val="left"/>
               <w:rPr>
                 <w:rFonts w:ascii="Consolas" w:hAnsi="Consolas" w:cs="Consolas"/>
                 <w:sz w:val="16"/>
                 <w:szCs w:val="16"/>
+                <w:shd w:fill="auto" w:val="clear"/>
               </w:rPr>
             </w:pPr>
             <w:r>
@@ -1222,6 +1351,7 @@
                 <w:kern w:val="0"/>
                 <w:sz w:val="16"/>
                 <w:szCs w:val="16"/>
+                <w:shd w:fill="auto" w:val="clear"/>
                 <w:lang w:val="pt-BR" w:eastAsia="en-US" w:bidi="ar-SA"/>
               </w:rPr>
               <w:tab/>
@@ -1236,6 +1366,7 @@
                 <w:kern w:val="0"/>
                 <w:sz w:val="16"/>
                 <w:szCs w:val="16"/>
+                <w:shd w:fill="auto" w:val="clear"/>
                 <w:lang w:val="pt-BR" w:eastAsia="en-US" w:bidi="ar-SA"/>
               </w:rPr>
               <w:t>INTEGER</w:t>
@@ -1247,6 +1378,7 @@
                 <w:kern w:val="0"/>
                 <w:sz w:val="16"/>
                 <w:szCs w:val="16"/>
+                <w:shd w:fill="auto" w:val="clear"/>
                 <w:lang w:val="pt-BR" w:eastAsia="en-US" w:bidi="ar-SA"/>
               </w:rPr>
               <w:t>(</w:t>
@@ -1258,6 +1390,7 @@
                 <w:kern w:val="0"/>
                 <w:sz w:val="16"/>
                 <w:szCs w:val="16"/>
+                <w:shd w:fill="auto" w:val="clear"/>
                 <w:lang w:val="pt-BR" w:eastAsia="en-US" w:bidi="ar-SA"/>
               </w:rPr>
               <w:t>10</w:t>
@@ -1269,6 +1402,7 @@
                 <w:kern w:val="0"/>
                 <w:sz w:val="16"/>
                 <w:szCs w:val="16"/>
+                <w:shd w:fill="auto" w:val="clear"/>
                 <w:lang w:val="pt-BR" w:eastAsia="en-US" w:bidi="ar-SA"/>
               </w:rPr>
               <w:t xml:space="preserve">) </w:t>
@@ -1282,6 +1416,7 @@
                 <w:kern w:val="0"/>
                 <w:sz w:val="16"/>
                 <w:szCs w:val="16"/>
+                <w:shd w:fill="auto" w:val="clear"/>
                 <w:lang w:val="pt-BR" w:eastAsia="en-US" w:bidi="ar-SA"/>
               </w:rPr>
               <w:t>NOT</w:t>
@@ -1293,6 +1428,7 @@
                 <w:kern w:val="0"/>
                 <w:sz w:val="16"/>
                 <w:szCs w:val="16"/>
+                <w:shd w:fill="auto" w:val="clear"/>
                 <w:lang w:val="pt-BR" w:eastAsia="en-US" w:bidi="ar-SA"/>
               </w:rPr>
               <w:t xml:space="preserve"> </w:t>
@@ -1306,6 +1442,7 @@
                 <w:kern w:val="0"/>
                 <w:sz w:val="16"/>
                 <w:szCs w:val="16"/>
+                <w:shd w:fill="auto" w:val="clear"/>
                 <w:lang w:val="pt-BR" w:eastAsia="en-US" w:bidi="ar-SA"/>
               </w:rPr>
               <w:t>NULL</w:t>
@@ -1317,6 +1454,7 @@
                 <w:kern w:val="0"/>
                 <w:sz w:val="16"/>
                 <w:szCs w:val="16"/>
+                <w:shd w:fill="auto" w:val="clear"/>
                 <w:lang w:val="pt-BR" w:eastAsia="en-US" w:bidi="ar-SA"/>
               </w:rPr>
               <w:t xml:space="preserve">, </w:t>
@@ -1328,6 +1466,7 @@
                 <w:kern w:val="0"/>
                 <w:sz w:val="16"/>
                 <w:szCs w:val="16"/>
+                <w:shd w:fill="auto" w:val="clear"/>
                 <w:lang w:val="pt-BR" w:eastAsia="en-US" w:bidi="ar-SA"/>
               </w:rPr>
               <w:t>-- identificacao unica da conta corrente</w:t>
@@ -1336,13 +1475,15 @@
           <w:p>
             <w:pPr>
               <w:pStyle w:val="Normal"/>
-              <w:widowControl/>
+              <w:widowControl w:val="false"/>
+              <w:suppressAutoHyphens w:val="true"/>
               <w:spacing w:before="0" w:after="0"/>
               <w:jc w:val="left"/>
               <w:rPr>
                 <w:rFonts w:ascii="Consolas" w:hAnsi="Consolas" w:cs="Consolas"/>
                 <w:sz w:val="16"/>
                 <w:szCs w:val="16"/>
+                <w:shd w:fill="auto" w:val="clear"/>
               </w:rPr>
             </w:pPr>
             <w:r>
@@ -1352,6 +1493,7 @@
                 <w:kern w:val="0"/>
                 <w:sz w:val="16"/>
                 <w:szCs w:val="16"/>
+                <w:shd w:fill="auto" w:val="clear"/>
                 <w:lang w:val="pt-BR" w:eastAsia="en-US" w:bidi="ar-SA"/>
               </w:rPr>
               <w:tab/>
@@ -1366,6 +1508,7 @@
                 <w:kern w:val="0"/>
                 <w:sz w:val="16"/>
                 <w:szCs w:val="16"/>
+                <w:shd w:fill="auto" w:val="clear"/>
                 <w:lang w:val="pt-BR" w:eastAsia="en-US" w:bidi="ar-SA"/>
               </w:rPr>
               <w:t>TEXT</w:t>
@@ -1377,6 +1520,7 @@
                 <w:kern w:val="0"/>
                 <w:sz w:val="16"/>
                 <w:szCs w:val="16"/>
+                <w:shd w:fill="auto" w:val="clear"/>
                 <w:lang w:val="pt-BR" w:eastAsia="en-US" w:bidi="ar-SA"/>
               </w:rPr>
               <w:t>(</w:t>
@@ -1388,6 +1532,7 @@
                 <w:kern w:val="0"/>
                 <w:sz w:val="16"/>
                 <w:szCs w:val="16"/>
+                <w:shd w:fill="auto" w:val="clear"/>
                 <w:lang w:val="pt-BR" w:eastAsia="en-US" w:bidi="ar-SA"/>
               </w:rPr>
               <w:t>25</w:t>
@@ -1399,6 +1544,7 @@
                 <w:kern w:val="0"/>
                 <w:sz w:val="16"/>
                 <w:szCs w:val="16"/>
+                <w:shd w:fill="auto" w:val="clear"/>
                 <w:lang w:val="pt-BR" w:eastAsia="en-US" w:bidi="ar-SA"/>
               </w:rPr>
               <w:t xml:space="preserve">) </w:t>
@@ -1412,6 +1558,7 @@
                 <w:kern w:val="0"/>
                 <w:sz w:val="16"/>
                 <w:szCs w:val="16"/>
+                <w:shd w:fill="auto" w:val="clear"/>
                 <w:lang w:val="pt-BR" w:eastAsia="en-US" w:bidi="ar-SA"/>
               </w:rPr>
               <w:t>NOT</w:t>
@@ -1423,6 +1570,7 @@
                 <w:kern w:val="0"/>
                 <w:sz w:val="16"/>
                 <w:szCs w:val="16"/>
+                <w:shd w:fill="auto" w:val="clear"/>
                 <w:lang w:val="pt-BR" w:eastAsia="en-US" w:bidi="ar-SA"/>
               </w:rPr>
               <w:t xml:space="preserve"> </w:t>
@@ -1436,6 +1584,7 @@
                 <w:kern w:val="0"/>
                 <w:sz w:val="16"/>
                 <w:szCs w:val="16"/>
+                <w:shd w:fill="auto" w:val="clear"/>
                 <w:lang w:val="pt-BR" w:eastAsia="en-US" w:bidi="ar-SA"/>
               </w:rPr>
               <w:t>NULL</w:t>
@@ -1447,6 +1596,7 @@
                 <w:kern w:val="0"/>
                 <w:sz w:val="16"/>
                 <w:szCs w:val="16"/>
+                <w:shd w:fill="auto" w:val="clear"/>
                 <w:lang w:val="pt-BR" w:eastAsia="en-US" w:bidi="ar-SA"/>
               </w:rPr>
               <w:t xml:space="preserve">, </w:t>
@@ -1458,6 +1608,7 @@
                 <w:kern w:val="0"/>
                 <w:sz w:val="16"/>
                 <w:szCs w:val="16"/>
+                <w:shd w:fill="auto" w:val="clear"/>
                 <w:lang w:val="pt-BR" w:eastAsia="en-US" w:bidi="ar-SA"/>
               </w:rPr>
               <w:t>-- data do movimento no formato DD/MM/YYYY</w:t>
@@ -1466,13 +1617,15 @@
           <w:p>
             <w:pPr>
               <w:pStyle w:val="Normal"/>
-              <w:widowControl/>
+              <w:widowControl w:val="false"/>
+              <w:suppressAutoHyphens w:val="true"/>
               <w:spacing w:before="0" w:after="0"/>
               <w:jc w:val="left"/>
               <w:rPr>
                 <w:rFonts w:ascii="Consolas" w:hAnsi="Consolas" w:cs="Consolas"/>
                 <w:sz w:val="16"/>
                 <w:szCs w:val="16"/>
+                <w:shd w:fill="auto" w:val="clear"/>
               </w:rPr>
             </w:pPr>
             <w:r>
@@ -1482,6 +1635,7 @@
                 <w:kern w:val="0"/>
                 <w:sz w:val="16"/>
                 <w:szCs w:val="16"/>
+                <w:shd w:fill="auto" w:val="clear"/>
                 <w:lang w:val="pt-BR" w:eastAsia="en-US" w:bidi="ar-SA"/>
               </w:rPr>
               <w:tab/>
@@ -1496,6 +1650,7 @@
                 <w:kern w:val="0"/>
                 <w:sz w:val="16"/>
                 <w:szCs w:val="16"/>
+                <w:shd w:fill="auto" w:val="clear"/>
                 <w:lang w:val="pt-BR" w:eastAsia="en-US" w:bidi="ar-SA"/>
               </w:rPr>
               <w:t>TEXT</w:t>
@@ -1507,6 +1662,7 @@
                 <w:kern w:val="0"/>
                 <w:sz w:val="16"/>
                 <w:szCs w:val="16"/>
+                <w:shd w:fill="auto" w:val="clear"/>
                 <w:lang w:val="pt-BR" w:eastAsia="en-US" w:bidi="ar-SA"/>
               </w:rPr>
               <w:t>(</w:t>
@@ -1518,6 +1674,7 @@
                 <w:kern w:val="0"/>
                 <w:sz w:val="16"/>
                 <w:szCs w:val="16"/>
+                <w:shd w:fill="auto" w:val="clear"/>
                 <w:lang w:val="pt-BR" w:eastAsia="en-US" w:bidi="ar-SA"/>
               </w:rPr>
               <w:t>1</w:t>
@@ -1529,6 +1686,7 @@
                 <w:kern w:val="0"/>
                 <w:sz w:val="16"/>
                 <w:szCs w:val="16"/>
+                <w:shd w:fill="auto" w:val="clear"/>
                 <w:lang w:val="pt-BR" w:eastAsia="en-US" w:bidi="ar-SA"/>
               </w:rPr>
               <w:t xml:space="preserve">) </w:t>
@@ -1542,6 +1700,7 @@
                 <w:kern w:val="0"/>
                 <w:sz w:val="16"/>
                 <w:szCs w:val="16"/>
+                <w:shd w:fill="auto" w:val="clear"/>
                 <w:lang w:val="pt-BR" w:eastAsia="en-US" w:bidi="ar-SA"/>
               </w:rPr>
               <w:t>NOT</w:t>
@@ -1553,6 +1712,7 @@
                 <w:kern w:val="0"/>
                 <w:sz w:val="16"/>
                 <w:szCs w:val="16"/>
+                <w:shd w:fill="auto" w:val="clear"/>
                 <w:lang w:val="pt-BR" w:eastAsia="en-US" w:bidi="ar-SA"/>
               </w:rPr>
               <w:t xml:space="preserve"> </w:t>
@@ -1566,6 +1726,7 @@
                 <w:kern w:val="0"/>
                 <w:sz w:val="16"/>
                 <w:szCs w:val="16"/>
+                <w:shd w:fill="auto" w:val="clear"/>
                 <w:lang w:val="pt-BR" w:eastAsia="en-US" w:bidi="ar-SA"/>
               </w:rPr>
               <w:t>NULL</w:t>
@@ -1577,6 +1738,7 @@
                 <w:kern w:val="0"/>
                 <w:sz w:val="16"/>
                 <w:szCs w:val="16"/>
+                <w:shd w:fill="auto" w:val="clear"/>
                 <w:lang w:val="pt-BR" w:eastAsia="en-US" w:bidi="ar-SA"/>
               </w:rPr>
               <w:t xml:space="preserve">, </w:t>
@@ -1588,6 +1750,7 @@
                 <w:kern w:val="0"/>
                 <w:sz w:val="16"/>
                 <w:szCs w:val="16"/>
+                <w:shd w:fill="auto" w:val="clear"/>
                 <w:lang w:val="pt-BR" w:eastAsia="en-US" w:bidi="ar-SA"/>
               </w:rPr>
               <w:t>-- tipo do movimento. (C = Credito, D = Debito).</w:t>
@@ -1596,13 +1759,15 @@
           <w:p>
             <w:pPr>
               <w:pStyle w:val="Normal"/>
-              <w:widowControl/>
+              <w:widowControl w:val="false"/>
+              <w:suppressAutoHyphens w:val="true"/>
               <w:spacing w:before="0" w:after="0"/>
               <w:jc w:val="left"/>
               <w:rPr>
                 <w:rFonts w:ascii="Consolas" w:hAnsi="Consolas" w:cs="Consolas"/>
                 <w:sz w:val="16"/>
                 <w:szCs w:val="16"/>
+                <w:shd w:fill="auto" w:val="clear"/>
               </w:rPr>
             </w:pPr>
             <w:r>
@@ -1612,6 +1777,7 @@
                 <w:kern w:val="0"/>
                 <w:sz w:val="16"/>
                 <w:szCs w:val="16"/>
+                <w:shd w:fill="auto" w:val="clear"/>
                 <w:lang w:val="pt-BR" w:eastAsia="en-US" w:bidi="ar-SA"/>
               </w:rPr>
               <w:tab/>
@@ -1626,6 +1792,7 @@
                 <w:kern w:val="0"/>
                 <w:sz w:val="16"/>
                 <w:szCs w:val="16"/>
+                <w:shd w:fill="auto" w:val="clear"/>
                 <w:lang w:val="pt-BR" w:eastAsia="en-US" w:bidi="ar-SA"/>
               </w:rPr>
               <w:t>REAL</w:t>
@@ -1637,6 +1804,7 @@
                 <w:kern w:val="0"/>
                 <w:sz w:val="16"/>
                 <w:szCs w:val="16"/>
+                <w:shd w:fill="auto" w:val="clear"/>
                 <w:lang w:val="pt-BR" w:eastAsia="en-US" w:bidi="ar-SA"/>
               </w:rPr>
               <w:t xml:space="preserve"> </w:t>
@@ -1650,6 +1818,7 @@
                 <w:kern w:val="0"/>
                 <w:sz w:val="16"/>
                 <w:szCs w:val="16"/>
+                <w:shd w:fill="auto" w:val="clear"/>
                 <w:lang w:val="pt-BR" w:eastAsia="en-US" w:bidi="ar-SA"/>
               </w:rPr>
               <w:t>NOT</w:t>
@@ -1661,6 +1830,7 @@
                 <w:kern w:val="0"/>
                 <w:sz w:val="16"/>
                 <w:szCs w:val="16"/>
+                <w:shd w:fill="auto" w:val="clear"/>
                 <w:lang w:val="pt-BR" w:eastAsia="en-US" w:bidi="ar-SA"/>
               </w:rPr>
               <w:t xml:space="preserve"> </w:t>
@@ -1674,6 +1844,7 @@
                 <w:kern w:val="0"/>
                 <w:sz w:val="16"/>
                 <w:szCs w:val="16"/>
+                <w:shd w:fill="auto" w:val="clear"/>
                 <w:lang w:val="pt-BR" w:eastAsia="en-US" w:bidi="ar-SA"/>
               </w:rPr>
               <w:t>NULL</w:t>
@@ -1685,6 +1856,7 @@
                 <w:kern w:val="0"/>
                 <w:sz w:val="16"/>
                 <w:szCs w:val="16"/>
+                <w:shd w:fill="auto" w:val="clear"/>
                 <w:lang w:val="pt-BR" w:eastAsia="en-US" w:bidi="ar-SA"/>
               </w:rPr>
               <w:t xml:space="preserve">, </w:t>
@@ -1696,6 +1868,7 @@
                 <w:kern w:val="0"/>
                 <w:sz w:val="16"/>
                 <w:szCs w:val="16"/>
+                <w:shd w:fill="auto" w:val="clear"/>
                 <w:lang w:val="pt-BR" w:eastAsia="en-US" w:bidi="ar-SA"/>
               </w:rPr>
               <w:t>-- valor do movimento. Usar duas casas decimais.</w:t>
@@ -1704,13 +1877,15 @@
           <w:p>
             <w:pPr>
               <w:pStyle w:val="Normal"/>
-              <w:widowControl/>
+              <w:widowControl w:val="false"/>
+              <w:suppressAutoHyphens w:val="true"/>
               <w:spacing w:before="0" w:after="0"/>
               <w:jc w:val="left"/>
               <w:rPr>
                 <w:rFonts w:ascii="Consolas" w:hAnsi="Consolas" w:cs="Consolas"/>
                 <w:sz w:val="16"/>
                 <w:szCs w:val="16"/>
+                <w:shd w:fill="auto" w:val="clear"/>
               </w:rPr>
             </w:pPr>
             <w:r>
@@ -1720,6 +1895,7 @@
                 <w:kern w:val="0"/>
                 <w:sz w:val="16"/>
                 <w:szCs w:val="16"/>
+                <w:shd w:fill="auto" w:val="clear"/>
                 <w:lang w:val="pt-BR" w:eastAsia="en-US" w:bidi="ar-SA"/>
               </w:rPr>
               <w:tab/>
@@ -1733,6 +1909,7 @@
                 <w:kern w:val="0"/>
                 <w:sz w:val="16"/>
                 <w:szCs w:val="16"/>
+                <w:shd w:fill="auto" w:val="clear"/>
                 <w:lang w:val="pt-BR" w:eastAsia="en-US" w:bidi="ar-SA"/>
               </w:rPr>
               <w:t>CHECK</w:t>
@@ -1744,6 +1921,7 @@
                 <w:kern w:val="0"/>
                 <w:sz w:val="16"/>
                 <w:szCs w:val="16"/>
+                <w:shd w:fill="auto" w:val="clear"/>
                 <w:lang w:val="pt-BR" w:eastAsia="en-US" w:bidi="ar-SA"/>
               </w:rPr>
               <w:t xml:space="preserve"> (tipomovimento </w:t>
@@ -1757,6 +1935,7 @@
                 <w:kern w:val="0"/>
                 <w:sz w:val="16"/>
                 <w:szCs w:val="16"/>
+                <w:shd w:fill="auto" w:val="clear"/>
                 <w:lang w:val="pt-BR" w:eastAsia="en-US" w:bidi="ar-SA"/>
               </w:rPr>
               <w:t>in</w:t>
@@ -1768,6 +1947,7 @@
                 <w:kern w:val="0"/>
                 <w:sz w:val="16"/>
                 <w:szCs w:val="16"/>
+                <w:shd w:fill="auto" w:val="clear"/>
                 <w:lang w:val="pt-BR" w:eastAsia="en-US" w:bidi="ar-SA"/>
               </w:rPr>
               <w:t xml:space="preserve"> (</w:t>
@@ -1779,6 +1959,7 @@
                 <w:kern w:val="0"/>
                 <w:sz w:val="16"/>
                 <w:szCs w:val="16"/>
+                <w:shd w:fill="auto" w:val="clear"/>
                 <w:lang w:val="pt-BR" w:eastAsia="en-US" w:bidi="ar-SA"/>
               </w:rPr>
               <w:t>'C'</w:t>
@@ -1790,6 +1971,7 @@
                 <w:kern w:val="0"/>
                 <w:sz w:val="16"/>
                 <w:szCs w:val="16"/>
+                <w:shd w:fill="auto" w:val="clear"/>
                 <w:lang w:val="pt-BR" w:eastAsia="en-US" w:bidi="ar-SA"/>
               </w:rPr>
               <w:t>,</w:t>
@@ -1801,6 +1983,7 @@
                 <w:kern w:val="0"/>
                 <w:sz w:val="16"/>
                 <w:szCs w:val="16"/>
+                <w:shd w:fill="auto" w:val="clear"/>
                 <w:lang w:val="pt-BR" w:eastAsia="en-US" w:bidi="ar-SA"/>
               </w:rPr>
               <w:t>'D'</w:t>
@@ -1812,6 +1995,7 @@
                 <w:kern w:val="0"/>
                 <w:sz w:val="16"/>
                 <w:szCs w:val="16"/>
+                <w:shd w:fill="auto" w:val="clear"/>
                 <w:lang w:val="pt-BR" w:eastAsia="en-US" w:bidi="ar-SA"/>
               </w:rPr>
               <w:t>)),</w:t>
@@ -1820,13 +2004,15 @@
           <w:p>
             <w:pPr>
               <w:pStyle w:val="Normal"/>
-              <w:widowControl/>
+              <w:widowControl w:val="false"/>
+              <w:suppressAutoHyphens w:val="true"/>
               <w:spacing w:before="0" w:after="0"/>
               <w:jc w:val="left"/>
               <w:rPr>
                 <w:rFonts w:ascii="Consolas" w:hAnsi="Consolas" w:cs="Consolas"/>
                 <w:sz w:val="16"/>
                 <w:szCs w:val="16"/>
+                <w:shd w:fill="auto" w:val="clear"/>
               </w:rPr>
             </w:pPr>
             <w:r>
@@ -1836,6 +2022,7 @@
                 <w:kern w:val="0"/>
                 <w:sz w:val="16"/>
                 <w:szCs w:val="16"/>
+                <w:shd w:fill="auto" w:val="clear"/>
                 <w:lang w:val="pt-BR" w:eastAsia="en-US" w:bidi="ar-SA"/>
               </w:rPr>
               <w:tab/>
@@ -1849,6 +2036,7 @@
                 <w:kern w:val="0"/>
                 <w:sz w:val="16"/>
                 <w:szCs w:val="16"/>
+                <w:shd w:fill="auto" w:val="clear"/>
                 <w:lang w:val="pt-BR" w:eastAsia="en-US" w:bidi="ar-SA"/>
               </w:rPr>
               <w:t>FOREIGN</w:t>
@@ -1860,6 +2048,7 @@
                 <w:kern w:val="0"/>
                 <w:sz w:val="16"/>
                 <w:szCs w:val="16"/>
+                <w:shd w:fill="auto" w:val="clear"/>
                 <w:lang w:val="pt-BR" w:eastAsia="en-US" w:bidi="ar-SA"/>
               </w:rPr>
               <w:t xml:space="preserve"> </w:t>
@@ -1873,6 +2062,7 @@
                 <w:kern w:val="0"/>
                 <w:sz w:val="16"/>
                 <w:szCs w:val="16"/>
+                <w:shd w:fill="auto" w:val="clear"/>
                 <w:lang w:val="pt-BR" w:eastAsia="en-US" w:bidi="ar-SA"/>
               </w:rPr>
               <w:t>KEY</w:t>
@@ -1884,6 +2074,7 @@
                 <w:kern w:val="0"/>
                 <w:sz w:val="16"/>
                 <w:szCs w:val="16"/>
+                <w:shd w:fill="auto" w:val="clear"/>
                 <w:lang w:val="pt-BR" w:eastAsia="en-US" w:bidi="ar-SA"/>
               </w:rPr>
               <w:t xml:space="preserve">(idcontacorrente) </w:t>
@@ -1897,6 +2088,7 @@
                 <w:kern w:val="0"/>
                 <w:sz w:val="16"/>
                 <w:szCs w:val="16"/>
+                <w:shd w:fill="auto" w:val="clear"/>
                 <w:lang w:val="pt-BR" w:eastAsia="en-US" w:bidi="ar-SA"/>
               </w:rPr>
               <w:t>REFERENCES</w:t>
@@ -1908,6 +2100,7 @@
                 <w:kern w:val="0"/>
                 <w:sz w:val="16"/>
                 <w:szCs w:val="16"/>
+                <w:shd w:fill="auto" w:val="clear"/>
                 <w:lang w:val="pt-BR" w:eastAsia="en-US" w:bidi="ar-SA"/>
               </w:rPr>
               <w:t xml:space="preserve"> contacorrente(idcontacorrente)</w:t>
@@ -1916,13 +2109,15 @@
           <w:p>
             <w:pPr>
               <w:pStyle w:val="Normal"/>
-              <w:widowControl/>
+              <w:widowControl w:val="false"/>
+              <w:suppressAutoHyphens w:val="true"/>
               <w:spacing w:before="0" w:after="0"/>
               <w:jc w:val="left"/>
               <w:rPr>
                 <w:rFonts w:ascii="Consolas" w:hAnsi="Consolas" w:cs="Consolas"/>
                 <w:sz w:val="16"/>
                 <w:szCs w:val="16"/>
+                <w:shd w:fill="auto" w:val="clear"/>
               </w:rPr>
             </w:pPr>
             <w:r>
@@ -1932,6 +2127,7 @@
                 <w:kern w:val="0"/>
                 <w:sz w:val="16"/>
                 <w:szCs w:val="16"/>
+                <w:shd w:fill="auto" w:val="clear"/>
                 <w:lang w:val="pt-BR" w:eastAsia="en-US" w:bidi="ar-SA"/>
               </w:rPr>
               <w:t>)</w:t>
@@ -1943,6 +2139,7 @@
                 <w:kern w:val="0"/>
                 <w:sz w:val="16"/>
                 <w:szCs w:val="16"/>
+                <w:shd w:fill="auto" w:val="clear"/>
                 <w:lang w:val="pt-BR" w:eastAsia="en-US" w:bidi="ar-SA"/>
               </w:rPr>
               <w:t>;</w:t>
@@ -1951,35 +2148,38 @@
           <w:p>
             <w:pPr>
               <w:pStyle w:val="Normal"/>
-              <w:widowControl/>
+              <w:widowControl w:val="false"/>
+              <w:suppressAutoHyphens w:val="true"/>
               <w:spacing w:before="0" w:after="0"/>
               <w:jc w:val="left"/>
               <w:rPr>
                 <w:rFonts w:ascii="Consolas" w:hAnsi="Consolas" w:cs="Consolas"/>
                 <w:sz w:val="16"/>
                 <w:szCs w:val="16"/>
+                <w:shd w:fill="auto" w:val="clear"/>
               </w:rPr>
             </w:pPr>
             <w:r>
               <w:rPr>
-                <w:rFonts w:eastAsia="Calibri" w:cs="Consolas" w:ascii="Consolas" w:hAnsi="Consolas"/>
-                <w:kern w:val="0"/>
-                <w:sz w:val="16"/>
-                <w:szCs w:val="16"/>
-                <w:lang w:val="pt-BR" w:eastAsia="en-US" w:bidi="ar-SA"/>
+                <w:rFonts w:cs="Consolas" w:ascii="Consolas" w:hAnsi="Consolas"/>
+                <w:sz w:val="16"/>
+                <w:szCs w:val="16"/>
+                <w:shd w:fill="auto" w:val="clear"/>
               </w:rPr>
             </w:r>
           </w:p>
           <w:p>
             <w:pPr>
               <w:pStyle w:val="Normal"/>
-              <w:widowControl/>
+              <w:widowControl w:val="false"/>
+              <w:suppressAutoHyphens w:val="true"/>
               <w:spacing w:before="0" w:after="0"/>
               <w:jc w:val="left"/>
               <w:rPr>
                 <w:rFonts w:ascii="Consolas" w:hAnsi="Consolas" w:cs="Consolas"/>
                 <w:sz w:val="16"/>
                 <w:szCs w:val="16"/>
+                <w:shd w:fill="auto" w:val="clear"/>
               </w:rPr>
             </w:pPr>
             <w:r>
@@ -1991,6 +2191,7 @@
                 <w:kern w:val="0"/>
                 <w:sz w:val="16"/>
                 <w:szCs w:val="16"/>
+                <w:shd w:fill="auto" w:val="clear"/>
                 <w:lang w:val="pt-BR" w:eastAsia="en-US" w:bidi="ar-SA"/>
               </w:rPr>
               <w:t>CREATE</w:t>
@@ -2002,6 +2203,7 @@
                 <w:kern w:val="0"/>
                 <w:sz w:val="16"/>
                 <w:szCs w:val="16"/>
+                <w:shd w:fill="auto" w:val="clear"/>
                 <w:lang w:val="pt-BR" w:eastAsia="en-US" w:bidi="ar-SA"/>
               </w:rPr>
               <w:t xml:space="preserve"> </w:t>
@@ -2015,6 +2217,7 @@
                 <w:kern w:val="0"/>
                 <w:sz w:val="16"/>
                 <w:szCs w:val="16"/>
+                <w:shd w:fill="auto" w:val="clear"/>
                 <w:lang w:val="pt-BR" w:eastAsia="en-US" w:bidi="ar-SA"/>
               </w:rPr>
               <w:t>TABLE</w:t>
@@ -2026,6 +2229,7 @@
                 <w:kern w:val="0"/>
                 <w:sz w:val="16"/>
                 <w:szCs w:val="16"/>
+                <w:shd w:fill="auto" w:val="clear"/>
                 <w:lang w:val="pt-BR" w:eastAsia="en-US" w:bidi="ar-SA"/>
               </w:rPr>
               <w:t xml:space="preserve"> idempotencia (</w:t>
@@ -2034,13 +2238,15 @@
           <w:p>
             <w:pPr>
               <w:pStyle w:val="Normal"/>
-              <w:widowControl/>
+              <w:widowControl w:val="false"/>
+              <w:suppressAutoHyphens w:val="true"/>
               <w:spacing w:before="0" w:after="0"/>
               <w:jc w:val="left"/>
               <w:rPr>
                 <w:rFonts w:ascii="Consolas" w:hAnsi="Consolas" w:cs="Consolas"/>
                 <w:sz w:val="16"/>
                 <w:szCs w:val="16"/>
+                <w:shd w:fill="auto" w:val="clear"/>
               </w:rPr>
             </w:pPr>
             <w:r>
@@ -2050,6 +2256,7 @@
                 <w:kern w:val="0"/>
                 <w:sz w:val="16"/>
                 <w:szCs w:val="16"/>
+                <w:shd w:fill="auto" w:val="clear"/>
                 <w:lang w:val="pt-BR" w:eastAsia="en-US" w:bidi="ar-SA"/>
               </w:rPr>
               <w:tab/>
@@ -2064,6 +2271,7 @@
                 <w:kern w:val="0"/>
                 <w:sz w:val="16"/>
                 <w:szCs w:val="16"/>
+                <w:shd w:fill="auto" w:val="clear"/>
                 <w:lang w:val="pt-BR" w:eastAsia="en-US" w:bidi="ar-SA"/>
               </w:rPr>
               <w:t>TEXT</w:t>
@@ -2075,6 +2283,7 @@
                 <w:kern w:val="0"/>
                 <w:sz w:val="16"/>
                 <w:szCs w:val="16"/>
+                <w:shd w:fill="auto" w:val="clear"/>
                 <w:lang w:val="pt-BR" w:eastAsia="en-US" w:bidi="ar-SA"/>
               </w:rPr>
               <w:t>(</w:t>
@@ -2086,6 +2295,7 @@
                 <w:kern w:val="0"/>
                 <w:sz w:val="16"/>
                 <w:szCs w:val="16"/>
+                <w:shd w:fill="auto" w:val="clear"/>
                 <w:lang w:val="pt-BR" w:eastAsia="en-US" w:bidi="ar-SA"/>
               </w:rPr>
               <w:t>37</w:t>
@@ -2097,6 +2307,7 @@
                 <w:kern w:val="0"/>
                 <w:sz w:val="16"/>
                 <w:szCs w:val="16"/>
+                <w:shd w:fill="auto" w:val="clear"/>
                 <w:lang w:val="pt-BR" w:eastAsia="en-US" w:bidi="ar-SA"/>
               </w:rPr>
               <w:t xml:space="preserve">) </w:t>
@@ -2110,6 +2321,7 @@
                 <w:kern w:val="0"/>
                 <w:sz w:val="16"/>
                 <w:szCs w:val="16"/>
+                <w:shd w:fill="auto" w:val="clear"/>
                 <w:lang w:val="pt-BR" w:eastAsia="en-US" w:bidi="ar-SA"/>
               </w:rPr>
               <w:t>PRIMARY</w:t>
@@ -2121,6 +2333,7 @@
                 <w:kern w:val="0"/>
                 <w:sz w:val="16"/>
                 <w:szCs w:val="16"/>
+                <w:shd w:fill="auto" w:val="clear"/>
                 <w:lang w:val="pt-BR" w:eastAsia="en-US" w:bidi="ar-SA"/>
               </w:rPr>
               <w:t xml:space="preserve"> </w:t>
@@ -2134,6 +2347,7 @@
                 <w:kern w:val="0"/>
                 <w:sz w:val="16"/>
                 <w:szCs w:val="16"/>
+                <w:shd w:fill="auto" w:val="clear"/>
                 <w:lang w:val="pt-BR" w:eastAsia="en-US" w:bidi="ar-SA"/>
               </w:rPr>
               <w:t>KEY</w:t>
@@ -2145,6 +2359,7 @@
                 <w:kern w:val="0"/>
                 <w:sz w:val="16"/>
                 <w:szCs w:val="16"/>
+                <w:shd w:fill="auto" w:val="clear"/>
                 <w:lang w:val="pt-BR" w:eastAsia="en-US" w:bidi="ar-SA"/>
               </w:rPr>
               <w:t xml:space="preserve">, </w:t>
@@ -2156,6 +2371,7 @@
                 <w:kern w:val="0"/>
                 <w:sz w:val="16"/>
                 <w:szCs w:val="16"/>
+                <w:shd w:fill="auto" w:val="clear"/>
                 <w:lang w:val="pt-BR" w:eastAsia="en-US" w:bidi="ar-SA"/>
               </w:rPr>
               <w:t>-- identificacao chave de idempotencia</w:t>
@@ -2164,13 +2380,15 @@
           <w:p>
             <w:pPr>
               <w:pStyle w:val="Normal"/>
-              <w:widowControl/>
+              <w:widowControl w:val="false"/>
+              <w:suppressAutoHyphens w:val="true"/>
               <w:spacing w:before="0" w:after="0"/>
               <w:jc w:val="left"/>
               <w:rPr>
                 <w:rFonts w:ascii="Consolas" w:hAnsi="Consolas" w:cs="Consolas"/>
                 <w:sz w:val="16"/>
                 <w:szCs w:val="16"/>
+                <w:shd w:fill="auto" w:val="clear"/>
               </w:rPr>
             </w:pPr>
             <w:r>
@@ -2180,6 +2398,7 @@
                 <w:kern w:val="0"/>
                 <w:sz w:val="16"/>
                 <w:szCs w:val="16"/>
+                <w:shd w:fill="auto" w:val="clear"/>
                 <w:lang w:val="pt-BR" w:eastAsia="en-US" w:bidi="ar-SA"/>
               </w:rPr>
               <w:tab/>
@@ -2194,6 +2413,7 @@
                 <w:kern w:val="0"/>
                 <w:sz w:val="16"/>
                 <w:szCs w:val="16"/>
+                <w:shd w:fill="auto" w:val="clear"/>
                 <w:lang w:val="pt-BR" w:eastAsia="en-US" w:bidi="ar-SA"/>
               </w:rPr>
               <w:t>TEXT</w:t>
@@ -2205,6 +2425,7 @@
                 <w:kern w:val="0"/>
                 <w:sz w:val="16"/>
                 <w:szCs w:val="16"/>
+                <w:shd w:fill="auto" w:val="clear"/>
                 <w:lang w:val="pt-BR" w:eastAsia="en-US" w:bidi="ar-SA"/>
               </w:rPr>
               <w:t>(</w:t>
@@ -2216,6 +2437,7 @@
                 <w:kern w:val="0"/>
                 <w:sz w:val="16"/>
                 <w:szCs w:val="16"/>
+                <w:shd w:fill="auto" w:val="clear"/>
                 <w:lang w:val="pt-BR" w:eastAsia="en-US" w:bidi="ar-SA"/>
               </w:rPr>
               <w:t>1000</w:t>
@@ -2227,6 +2449,7 @@
                 <w:kern w:val="0"/>
                 <w:sz w:val="16"/>
                 <w:szCs w:val="16"/>
+                <w:shd w:fill="auto" w:val="clear"/>
                 <w:lang w:val="pt-BR" w:eastAsia="en-US" w:bidi="ar-SA"/>
               </w:rPr>
               <w:t xml:space="preserve">), </w:t>
@@ -2238,6 +2461,7 @@
                 <w:kern w:val="0"/>
                 <w:sz w:val="16"/>
                 <w:szCs w:val="16"/>
+                <w:shd w:fill="auto" w:val="clear"/>
                 <w:lang w:val="pt-BR" w:eastAsia="en-US" w:bidi="ar-SA"/>
               </w:rPr>
               <w:t>-- dados de requisicao</w:t>
@@ -2246,13 +2470,15 @@
           <w:p>
             <w:pPr>
               <w:pStyle w:val="Normal"/>
-              <w:widowControl/>
+              <w:widowControl w:val="false"/>
+              <w:suppressAutoHyphens w:val="true"/>
               <w:spacing w:before="0" w:after="0"/>
               <w:jc w:val="left"/>
               <w:rPr>
                 <w:rFonts w:ascii="Consolas" w:hAnsi="Consolas" w:cs="Consolas"/>
                 <w:sz w:val="16"/>
                 <w:szCs w:val="16"/>
+                <w:shd w:fill="auto" w:val="clear"/>
               </w:rPr>
             </w:pPr>
             <w:r>
@@ -2262,6 +2488,7 @@
                 <w:kern w:val="0"/>
                 <w:sz w:val="16"/>
                 <w:szCs w:val="16"/>
+                <w:shd w:fill="auto" w:val="clear"/>
                 <w:lang w:val="pt-BR" w:eastAsia="en-US" w:bidi="ar-SA"/>
               </w:rPr>
               <w:tab/>
@@ -2276,6 +2503,7 @@
                 <w:kern w:val="0"/>
                 <w:sz w:val="16"/>
                 <w:szCs w:val="16"/>
+                <w:shd w:fill="auto" w:val="clear"/>
                 <w:lang w:val="pt-BR" w:eastAsia="en-US" w:bidi="ar-SA"/>
               </w:rPr>
               <w:t>TEXT</w:t>
@@ -2287,6 +2515,7 @@
                 <w:kern w:val="0"/>
                 <w:sz w:val="16"/>
                 <w:szCs w:val="16"/>
+                <w:shd w:fill="auto" w:val="clear"/>
                 <w:lang w:val="pt-BR" w:eastAsia="en-US" w:bidi="ar-SA"/>
               </w:rPr>
               <w:t>(</w:t>
@@ -2298,6 +2527,7 @@
                 <w:kern w:val="0"/>
                 <w:sz w:val="16"/>
                 <w:szCs w:val="16"/>
+                <w:shd w:fill="auto" w:val="clear"/>
                 <w:lang w:val="pt-BR" w:eastAsia="en-US" w:bidi="ar-SA"/>
               </w:rPr>
               <w:t>1000</w:t>
@@ -2309,6 +2539,7 @@
                 <w:kern w:val="0"/>
                 <w:sz w:val="16"/>
                 <w:szCs w:val="16"/>
+                <w:shd w:fill="auto" w:val="clear"/>
                 <w:lang w:val="pt-BR" w:eastAsia="en-US" w:bidi="ar-SA"/>
               </w:rPr>
               <w:t xml:space="preserve">) </w:t>
@@ -2320,6 +2551,7 @@
                 <w:kern w:val="0"/>
                 <w:sz w:val="16"/>
                 <w:szCs w:val="16"/>
+                <w:shd w:fill="auto" w:val="clear"/>
                 <w:lang w:val="pt-BR" w:eastAsia="en-US" w:bidi="ar-SA"/>
               </w:rPr>
               <w:t>-- dados de retorno</w:t>
@@ -2328,13 +2560,15 @@
           <w:p>
             <w:pPr>
               <w:pStyle w:val="Normal"/>
-              <w:widowControl/>
+              <w:widowControl w:val="false"/>
+              <w:suppressAutoHyphens w:val="true"/>
               <w:spacing w:before="0" w:after="0"/>
               <w:jc w:val="left"/>
               <w:rPr>
                 <w:rFonts w:ascii="Consolas" w:hAnsi="Consolas" w:cs="Consolas"/>
                 <w:sz w:val="16"/>
                 <w:szCs w:val="16"/>
+                <w:shd w:fill="auto" w:val="clear"/>
               </w:rPr>
             </w:pPr>
             <w:r>
@@ -2344,6 +2578,7 @@
                 <w:kern w:val="0"/>
                 <w:sz w:val="16"/>
                 <w:szCs w:val="16"/>
+                <w:shd w:fill="auto" w:val="clear"/>
                 <w:lang w:val="pt-BR" w:eastAsia="en-US" w:bidi="ar-SA"/>
               </w:rPr>
               <w:t>)</w:t>
@@ -2355,6 +2590,7 @@
                 <w:kern w:val="0"/>
                 <w:sz w:val="16"/>
                 <w:szCs w:val="16"/>
+                <w:shd w:fill="auto" w:val="clear"/>
                 <w:lang w:val="pt-BR" w:eastAsia="en-US" w:bidi="ar-SA"/>
               </w:rPr>
               <w:t>;</w:t>
@@ -2363,34 +2599,36 @@
           <w:p>
             <w:pPr>
               <w:pStyle w:val="Normal"/>
-              <w:widowControl/>
+              <w:widowControl w:val="false"/>
+              <w:suppressAutoHyphens w:val="true"/>
               <w:spacing w:before="0" w:after="0"/>
               <w:jc w:val="left"/>
               <w:rPr>
                 <w:sz w:val="16"/>
                 <w:szCs w:val="16"/>
+                <w:shd w:fill="auto" w:val="clear"/>
               </w:rPr>
             </w:pPr>
             <w:r>
               <w:rPr>
-                <w:rFonts w:eastAsia="Calibri" w:cs=""/>
-                <w:kern w:val="0"/>
-                <w:sz w:val="16"/>
-                <w:szCs w:val="16"/>
-                <w:lang w:val="pt-BR" w:eastAsia="en-US" w:bidi="ar-SA"/>
+                <w:sz w:val="16"/>
+                <w:szCs w:val="16"/>
+                <w:shd w:fill="auto" w:val="clear"/>
               </w:rPr>
             </w:r>
           </w:p>
           <w:p>
             <w:pPr>
               <w:pStyle w:val="Normal"/>
-              <w:widowControl/>
+              <w:widowControl w:val="false"/>
+              <w:suppressAutoHyphens w:val="true"/>
               <w:spacing w:before="0" w:after="0"/>
               <w:jc w:val="left"/>
               <w:rPr>
                 <w:rFonts w:ascii="Consolas" w:hAnsi="Consolas" w:cs="Consolas"/>
                 <w:sz w:val="16"/>
                 <w:szCs w:val="16"/>
+                <w:shd w:fill="auto" w:val="clear"/>
               </w:rPr>
             </w:pPr>
             <w:r>
@@ -2402,6 +2640,7 @@
                 <w:kern w:val="0"/>
                 <w:sz w:val="16"/>
                 <w:szCs w:val="16"/>
+                <w:shd w:fill="auto" w:val="clear"/>
                 <w:lang w:val="pt-BR" w:eastAsia="en-US" w:bidi="ar-SA"/>
               </w:rPr>
               <w:t>INSERT</w:t>
@@ -2413,6 +2652,7 @@
                 <w:kern w:val="0"/>
                 <w:sz w:val="16"/>
                 <w:szCs w:val="16"/>
+                <w:shd w:fill="auto" w:val="clear"/>
                 <w:lang w:val="pt-BR" w:eastAsia="en-US" w:bidi="ar-SA"/>
               </w:rPr>
               <w:t xml:space="preserve"> </w:t>
@@ -2426,6 +2666,7 @@
                 <w:kern w:val="0"/>
                 <w:sz w:val="16"/>
                 <w:szCs w:val="16"/>
+                <w:shd w:fill="auto" w:val="clear"/>
                 <w:lang w:val="pt-BR" w:eastAsia="en-US" w:bidi="ar-SA"/>
               </w:rPr>
               <w:t>INTO</w:t>
@@ -2437,6 +2678,7 @@
                 <w:kern w:val="0"/>
                 <w:sz w:val="16"/>
                 <w:szCs w:val="16"/>
+                <w:shd w:fill="auto" w:val="clear"/>
                 <w:lang w:val="pt-BR" w:eastAsia="en-US" w:bidi="ar-SA"/>
               </w:rPr>
               <w:t xml:space="preserve"> contacorrente(idcontacorrente, numero, nome, ativo) </w:t>
@@ -2450,6 +2692,7 @@
                 <w:kern w:val="0"/>
                 <w:sz w:val="16"/>
                 <w:szCs w:val="16"/>
+                <w:shd w:fill="auto" w:val="clear"/>
                 <w:lang w:val="pt-BR" w:eastAsia="en-US" w:bidi="ar-SA"/>
               </w:rPr>
               <w:t>VALUES</w:t>
@@ -2461,6 +2704,7 @@
                 <w:kern w:val="0"/>
                 <w:sz w:val="16"/>
                 <w:szCs w:val="16"/>
+                <w:shd w:fill="auto" w:val="clear"/>
                 <w:lang w:val="pt-BR" w:eastAsia="en-US" w:bidi="ar-SA"/>
               </w:rPr>
               <w:t>(</w:t>
@@ -2472,6 +2716,7 @@
                 <w:kern w:val="0"/>
                 <w:sz w:val="16"/>
                 <w:szCs w:val="16"/>
+                <w:shd w:fill="auto" w:val="clear"/>
                 <w:lang w:val="pt-BR" w:eastAsia="en-US" w:bidi="ar-SA"/>
               </w:rPr>
               <w:t>'B6BAFC09 -6967-ED11-A567-055DFA4A16C9'</w:t>
@@ -2483,6 +2728,7 @@
                 <w:kern w:val="0"/>
                 <w:sz w:val="16"/>
                 <w:szCs w:val="16"/>
+                <w:shd w:fill="auto" w:val="clear"/>
                 <w:lang w:val="pt-BR" w:eastAsia="en-US" w:bidi="ar-SA"/>
               </w:rPr>
               <w:t xml:space="preserve">, </w:t>
@@ -2494,6 +2740,7 @@
                 <w:kern w:val="0"/>
                 <w:sz w:val="16"/>
                 <w:szCs w:val="16"/>
+                <w:shd w:fill="auto" w:val="clear"/>
                 <w:lang w:val="pt-BR" w:eastAsia="en-US" w:bidi="ar-SA"/>
               </w:rPr>
               <w:t>123</w:t>
@@ -2505,6 +2752,7 @@
                 <w:kern w:val="0"/>
                 <w:sz w:val="16"/>
                 <w:szCs w:val="16"/>
+                <w:shd w:fill="auto" w:val="clear"/>
                 <w:lang w:val="pt-BR" w:eastAsia="en-US" w:bidi="ar-SA"/>
               </w:rPr>
               <w:t xml:space="preserve">, </w:t>
@@ -2516,6 +2764,7 @@
                 <w:kern w:val="0"/>
                 <w:sz w:val="16"/>
                 <w:szCs w:val="16"/>
+                <w:shd w:fill="auto" w:val="clear"/>
                 <w:lang w:val="pt-BR" w:eastAsia="en-US" w:bidi="ar-SA"/>
               </w:rPr>
               <w:t>'Katherine Sanchez'</w:t>
@@ -2527,6 +2776,7 @@
                 <w:kern w:val="0"/>
                 <w:sz w:val="16"/>
                 <w:szCs w:val="16"/>
+                <w:shd w:fill="auto" w:val="clear"/>
                 <w:lang w:val="pt-BR" w:eastAsia="en-US" w:bidi="ar-SA"/>
               </w:rPr>
               <w:t xml:space="preserve">, </w:t>
@@ -2538,6 +2788,7 @@
                 <w:kern w:val="0"/>
                 <w:sz w:val="16"/>
                 <w:szCs w:val="16"/>
+                <w:shd w:fill="auto" w:val="clear"/>
                 <w:lang w:val="pt-BR" w:eastAsia="en-US" w:bidi="ar-SA"/>
               </w:rPr>
               <w:t>1</w:t>
@@ -2549,6 +2800,7 @@
                 <w:kern w:val="0"/>
                 <w:sz w:val="16"/>
                 <w:szCs w:val="16"/>
+                <w:shd w:fill="auto" w:val="clear"/>
                 <w:lang w:val="pt-BR" w:eastAsia="en-US" w:bidi="ar-SA"/>
               </w:rPr>
               <w:t>)</w:t>
@@ -2560,6 +2812,7 @@
                 <w:kern w:val="0"/>
                 <w:sz w:val="16"/>
                 <w:szCs w:val="16"/>
+                <w:shd w:fill="auto" w:val="clear"/>
                 <w:lang w:val="pt-BR" w:eastAsia="en-US" w:bidi="ar-SA"/>
               </w:rPr>
               <w:t>;</w:t>
@@ -2568,13 +2821,15 @@
           <w:p>
             <w:pPr>
               <w:pStyle w:val="Normal"/>
-              <w:widowControl/>
+              <w:widowControl w:val="false"/>
+              <w:suppressAutoHyphens w:val="true"/>
               <w:spacing w:before="0" w:after="0"/>
               <w:jc w:val="left"/>
               <w:rPr>
                 <w:rFonts w:ascii="Consolas" w:hAnsi="Consolas" w:cs="Consolas"/>
                 <w:sz w:val="16"/>
                 <w:szCs w:val="16"/>
+                <w:shd w:fill="auto" w:val="clear"/>
               </w:rPr>
             </w:pPr>
             <w:r>
@@ -2586,6 +2841,7 @@
                 <w:kern w:val="0"/>
                 <w:sz w:val="16"/>
                 <w:szCs w:val="16"/>
+                <w:shd w:fill="auto" w:val="clear"/>
                 <w:lang w:val="pt-BR" w:eastAsia="en-US" w:bidi="ar-SA"/>
               </w:rPr>
               <w:t>INSERT</w:t>
@@ -2597,6 +2853,7 @@
                 <w:kern w:val="0"/>
                 <w:sz w:val="16"/>
                 <w:szCs w:val="16"/>
+                <w:shd w:fill="auto" w:val="clear"/>
                 <w:lang w:val="pt-BR" w:eastAsia="en-US" w:bidi="ar-SA"/>
               </w:rPr>
               <w:t xml:space="preserve"> </w:t>
@@ -2610,6 +2867,7 @@
                 <w:kern w:val="0"/>
                 <w:sz w:val="16"/>
                 <w:szCs w:val="16"/>
+                <w:shd w:fill="auto" w:val="clear"/>
                 <w:lang w:val="pt-BR" w:eastAsia="en-US" w:bidi="ar-SA"/>
               </w:rPr>
               <w:t>INTO</w:t>
@@ -2621,6 +2879,7 @@
                 <w:kern w:val="0"/>
                 <w:sz w:val="16"/>
                 <w:szCs w:val="16"/>
+                <w:shd w:fill="auto" w:val="clear"/>
                 <w:lang w:val="pt-BR" w:eastAsia="en-US" w:bidi="ar-SA"/>
               </w:rPr>
               <w:t xml:space="preserve"> contacorrente(idcontacorrente, numero, nome, ativo) </w:t>
@@ -2634,6 +2893,7 @@
                 <w:kern w:val="0"/>
                 <w:sz w:val="16"/>
                 <w:szCs w:val="16"/>
+                <w:shd w:fill="auto" w:val="clear"/>
                 <w:lang w:val="pt-BR" w:eastAsia="en-US" w:bidi="ar-SA"/>
               </w:rPr>
               <w:t>VALUES</w:t>
@@ -2645,6 +2905,7 @@
                 <w:kern w:val="0"/>
                 <w:sz w:val="16"/>
                 <w:szCs w:val="16"/>
+                <w:shd w:fill="auto" w:val="clear"/>
                 <w:lang w:val="pt-BR" w:eastAsia="en-US" w:bidi="ar-SA"/>
               </w:rPr>
               <w:t>(</w:t>
@@ -2656,6 +2917,7 @@
                 <w:kern w:val="0"/>
                 <w:sz w:val="16"/>
                 <w:szCs w:val="16"/>
+                <w:shd w:fill="auto" w:val="clear"/>
                 <w:lang w:val="pt-BR" w:eastAsia="en-US" w:bidi="ar-SA"/>
               </w:rPr>
               <w:t>'FA99D033-7067-ED11-96C6-7C5DFA4A16C9'</w:t>
@@ -2667,6 +2929,7 @@
                 <w:kern w:val="0"/>
                 <w:sz w:val="16"/>
                 <w:szCs w:val="16"/>
+                <w:shd w:fill="auto" w:val="clear"/>
                 <w:lang w:val="pt-BR" w:eastAsia="en-US" w:bidi="ar-SA"/>
               </w:rPr>
               <w:t xml:space="preserve">, </w:t>
@@ -2678,6 +2941,7 @@
                 <w:kern w:val="0"/>
                 <w:sz w:val="16"/>
                 <w:szCs w:val="16"/>
+                <w:shd w:fill="auto" w:val="clear"/>
                 <w:lang w:val="pt-BR" w:eastAsia="en-US" w:bidi="ar-SA"/>
               </w:rPr>
               <w:t>456</w:t>
@@ -2689,6 +2953,7 @@
                 <w:kern w:val="0"/>
                 <w:sz w:val="16"/>
                 <w:szCs w:val="16"/>
+                <w:shd w:fill="auto" w:val="clear"/>
                 <w:lang w:val="pt-BR" w:eastAsia="en-US" w:bidi="ar-SA"/>
               </w:rPr>
               <w:t xml:space="preserve">, </w:t>
@@ -2700,6 +2965,7 @@
                 <w:kern w:val="0"/>
                 <w:sz w:val="16"/>
                 <w:szCs w:val="16"/>
+                <w:shd w:fill="auto" w:val="clear"/>
                 <w:lang w:val="pt-BR" w:eastAsia="en-US" w:bidi="ar-SA"/>
               </w:rPr>
               <w:t>'Eva Woodward'</w:t>
@@ -2711,6 +2977,7 @@
                 <w:kern w:val="0"/>
                 <w:sz w:val="16"/>
                 <w:szCs w:val="16"/>
+                <w:shd w:fill="auto" w:val="clear"/>
                 <w:lang w:val="pt-BR" w:eastAsia="en-US" w:bidi="ar-SA"/>
               </w:rPr>
               <w:t xml:space="preserve">, </w:t>
@@ -2722,6 +2989,7 @@
                 <w:kern w:val="0"/>
                 <w:sz w:val="16"/>
                 <w:szCs w:val="16"/>
+                <w:shd w:fill="auto" w:val="clear"/>
                 <w:lang w:val="pt-BR" w:eastAsia="en-US" w:bidi="ar-SA"/>
               </w:rPr>
               <w:t>1</w:t>
@@ -2733,6 +3001,7 @@
                 <w:kern w:val="0"/>
                 <w:sz w:val="16"/>
                 <w:szCs w:val="16"/>
+                <w:shd w:fill="auto" w:val="clear"/>
                 <w:lang w:val="pt-BR" w:eastAsia="en-US" w:bidi="ar-SA"/>
               </w:rPr>
               <w:t>)</w:t>
@@ -2744,6 +3013,7 @@
                 <w:kern w:val="0"/>
                 <w:sz w:val="16"/>
                 <w:szCs w:val="16"/>
+                <w:shd w:fill="auto" w:val="clear"/>
                 <w:lang w:val="pt-BR" w:eastAsia="en-US" w:bidi="ar-SA"/>
               </w:rPr>
               <w:t>;</w:t>
@@ -2752,13 +3022,15 @@
           <w:p>
             <w:pPr>
               <w:pStyle w:val="Normal"/>
-              <w:widowControl/>
+              <w:widowControl w:val="false"/>
+              <w:suppressAutoHyphens w:val="true"/>
               <w:spacing w:before="0" w:after="0"/>
               <w:jc w:val="left"/>
               <w:rPr>
                 <w:rFonts w:ascii="Consolas" w:hAnsi="Consolas" w:cs="Consolas"/>
                 <w:sz w:val="16"/>
                 <w:szCs w:val="16"/>
+                <w:shd w:fill="auto" w:val="clear"/>
               </w:rPr>
             </w:pPr>
             <w:r>
@@ -2770,6 +3042,7 @@
                 <w:kern w:val="0"/>
                 <w:sz w:val="16"/>
                 <w:szCs w:val="16"/>
+                <w:shd w:fill="auto" w:val="clear"/>
                 <w:lang w:val="pt-BR" w:eastAsia="en-US" w:bidi="ar-SA"/>
               </w:rPr>
               <w:t>INSERT</w:t>
@@ -2781,6 +3054,7 @@
                 <w:kern w:val="0"/>
                 <w:sz w:val="16"/>
                 <w:szCs w:val="16"/>
+                <w:shd w:fill="auto" w:val="clear"/>
                 <w:lang w:val="pt-BR" w:eastAsia="en-US" w:bidi="ar-SA"/>
               </w:rPr>
               <w:t xml:space="preserve"> </w:t>
@@ -2794,6 +3068,7 @@
                 <w:kern w:val="0"/>
                 <w:sz w:val="16"/>
                 <w:szCs w:val="16"/>
+                <w:shd w:fill="auto" w:val="clear"/>
                 <w:lang w:val="pt-BR" w:eastAsia="en-US" w:bidi="ar-SA"/>
               </w:rPr>
               <w:t>INTO</w:t>
@@ -2805,6 +3080,7 @@
                 <w:kern w:val="0"/>
                 <w:sz w:val="16"/>
                 <w:szCs w:val="16"/>
+                <w:shd w:fill="auto" w:val="clear"/>
                 <w:lang w:val="pt-BR" w:eastAsia="en-US" w:bidi="ar-SA"/>
               </w:rPr>
               <w:t xml:space="preserve"> contacorrente(idcontacorrente, numero, nome, ativo) </w:t>
@@ -2818,6 +3094,7 @@
                 <w:kern w:val="0"/>
                 <w:sz w:val="16"/>
                 <w:szCs w:val="16"/>
+                <w:shd w:fill="auto" w:val="clear"/>
                 <w:lang w:val="pt-BR" w:eastAsia="en-US" w:bidi="ar-SA"/>
               </w:rPr>
               <w:t>VALUES</w:t>
@@ -2829,6 +3106,7 @@
                 <w:kern w:val="0"/>
                 <w:sz w:val="16"/>
                 <w:szCs w:val="16"/>
+                <w:shd w:fill="auto" w:val="clear"/>
                 <w:lang w:val="pt-BR" w:eastAsia="en-US" w:bidi="ar-SA"/>
               </w:rPr>
               <w:t>(</w:t>
@@ -2840,6 +3118,7 @@
                 <w:kern w:val="0"/>
                 <w:sz w:val="16"/>
                 <w:szCs w:val="16"/>
+                <w:shd w:fill="auto" w:val="clear"/>
                 <w:lang w:val="pt-BR" w:eastAsia="en-US" w:bidi="ar-SA"/>
               </w:rPr>
               <w:t>'382D323D-7067-ED11-8866-7D5DFA4A16C9'</w:t>
@@ -2851,6 +3130,7 @@
                 <w:kern w:val="0"/>
                 <w:sz w:val="16"/>
                 <w:szCs w:val="16"/>
+                <w:shd w:fill="auto" w:val="clear"/>
                 <w:lang w:val="pt-BR" w:eastAsia="en-US" w:bidi="ar-SA"/>
               </w:rPr>
               <w:t xml:space="preserve">, </w:t>
@@ -2862,6 +3142,7 @@
                 <w:kern w:val="0"/>
                 <w:sz w:val="16"/>
                 <w:szCs w:val="16"/>
+                <w:shd w:fill="auto" w:val="clear"/>
                 <w:lang w:val="pt-BR" w:eastAsia="en-US" w:bidi="ar-SA"/>
               </w:rPr>
               <w:t>789</w:t>
@@ -2873,6 +3154,7 @@
                 <w:kern w:val="0"/>
                 <w:sz w:val="16"/>
                 <w:szCs w:val="16"/>
+                <w:shd w:fill="auto" w:val="clear"/>
                 <w:lang w:val="pt-BR" w:eastAsia="en-US" w:bidi="ar-SA"/>
               </w:rPr>
               <w:t xml:space="preserve">, </w:t>
@@ -2884,6 +3166,7 @@
                 <w:kern w:val="0"/>
                 <w:sz w:val="16"/>
                 <w:szCs w:val="16"/>
+                <w:shd w:fill="auto" w:val="clear"/>
                 <w:lang w:val="pt-BR" w:eastAsia="en-US" w:bidi="ar-SA"/>
               </w:rPr>
               <w:t>'Tevin Mcconnell'</w:t>
@@ -2895,6 +3178,7 @@
                 <w:kern w:val="0"/>
                 <w:sz w:val="16"/>
                 <w:szCs w:val="16"/>
+                <w:shd w:fill="auto" w:val="clear"/>
                 <w:lang w:val="pt-BR" w:eastAsia="en-US" w:bidi="ar-SA"/>
               </w:rPr>
               <w:t xml:space="preserve">, </w:t>
@@ -2906,6 +3190,7 @@
                 <w:kern w:val="0"/>
                 <w:sz w:val="16"/>
                 <w:szCs w:val="16"/>
+                <w:shd w:fill="auto" w:val="clear"/>
                 <w:lang w:val="pt-BR" w:eastAsia="en-US" w:bidi="ar-SA"/>
               </w:rPr>
               <w:t>1</w:t>
@@ -2917,6 +3202,7 @@
                 <w:kern w:val="0"/>
                 <w:sz w:val="16"/>
                 <w:szCs w:val="16"/>
+                <w:shd w:fill="auto" w:val="clear"/>
                 <w:lang w:val="pt-BR" w:eastAsia="en-US" w:bidi="ar-SA"/>
               </w:rPr>
               <w:t>)</w:t>
@@ -2928,6 +3214,7 @@
                 <w:kern w:val="0"/>
                 <w:sz w:val="16"/>
                 <w:szCs w:val="16"/>
+                <w:shd w:fill="auto" w:val="clear"/>
                 <w:lang w:val="pt-BR" w:eastAsia="en-US" w:bidi="ar-SA"/>
               </w:rPr>
               <w:t>;</w:t>
@@ -2936,13 +3223,15 @@
           <w:p>
             <w:pPr>
               <w:pStyle w:val="Normal"/>
-              <w:widowControl/>
+              <w:widowControl w:val="false"/>
+              <w:suppressAutoHyphens w:val="true"/>
               <w:spacing w:before="0" w:after="0"/>
               <w:jc w:val="left"/>
               <w:rPr>
                 <w:rFonts w:ascii="Consolas" w:hAnsi="Consolas" w:cs="Consolas"/>
                 <w:sz w:val="16"/>
                 <w:szCs w:val="16"/>
+                <w:shd w:fill="auto" w:val="clear"/>
               </w:rPr>
             </w:pPr>
             <w:r>
@@ -2954,6 +3243,7 @@
                 <w:kern w:val="0"/>
                 <w:sz w:val="16"/>
                 <w:szCs w:val="16"/>
+                <w:shd w:fill="auto" w:val="clear"/>
                 <w:lang w:val="pt-BR" w:eastAsia="en-US" w:bidi="ar-SA"/>
               </w:rPr>
               <w:t>INSERT</w:t>
@@ -2965,6 +3255,7 @@
                 <w:kern w:val="0"/>
                 <w:sz w:val="16"/>
                 <w:szCs w:val="16"/>
+                <w:shd w:fill="auto" w:val="clear"/>
                 <w:lang w:val="pt-BR" w:eastAsia="en-US" w:bidi="ar-SA"/>
               </w:rPr>
               <w:t xml:space="preserve"> </w:t>
@@ -2978,6 +3269,7 @@
                 <w:kern w:val="0"/>
                 <w:sz w:val="16"/>
                 <w:szCs w:val="16"/>
+                <w:shd w:fill="auto" w:val="clear"/>
                 <w:lang w:val="pt-BR" w:eastAsia="en-US" w:bidi="ar-SA"/>
               </w:rPr>
               <w:t>INTO</w:t>
@@ -2989,6 +3281,7 @@
                 <w:kern w:val="0"/>
                 <w:sz w:val="16"/>
                 <w:szCs w:val="16"/>
+                <w:shd w:fill="auto" w:val="clear"/>
                 <w:lang w:val="pt-BR" w:eastAsia="en-US" w:bidi="ar-SA"/>
               </w:rPr>
               <w:t xml:space="preserve"> contacorrente(idcontacorrente, numero, nome, ativo) </w:t>
@@ -3002,6 +3295,7 @@
                 <w:kern w:val="0"/>
                 <w:sz w:val="16"/>
                 <w:szCs w:val="16"/>
+                <w:shd w:fill="auto" w:val="clear"/>
                 <w:lang w:val="pt-BR" w:eastAsia="en-US" w:bidi="ar-SA"/>
               </w:rPr>
               <w:t>VALUES</w:t>
@@ -3013,6 +3307,7 @@
                 <w:kern w:val="0"/>
                 <w:sz w:val="16"/>
                 <w:szCs w:val="16"/>
+                <w:shd w:fill="auto" w:val="clear"/>
                 <w:lang w:val="pt-BR" w:eastAsia="en-US" w:bidi="ar-SA"/>
               </w:rPr>
               <w:t>(</w:t>
@@ -3024,6 +3319,7 @@
                 <w:kern w:val="0"/>
                 <w:sz w:val="16"/>
                 <w:szCs w:val="16"/>
+                <w:shd w:fill="auto" w:val="clear"/>
                 <w:lang w:val="pt-BR" w:eastAsia="en-US" w:bidi="ar-SA"/>
               </w:rPr>
               <w:t>'F475F943-7067-ED11-A06B-7E5DFA4A16C9'</w:t>
@@ -3035,6 +3331,7 @@
                 <w:kern w:val="0"/>
                 <w:sz w:val="16"/>
                 <w:szCs w:val="16"/>
+                <w:shd w:fill="auto" w:val="clear"/>
                 <w:lang w:val="pt-BR" w:eastAsia="en-US" w:bidi="ar-SA"/>
               </w:rPr>
               <w:t xml:space="preserve">, </w:t>
@@ -3046,6 +3343,7 @@
                 <w:kern w:val="0"/>
                 <w:sz w:val="16"/>
                 <w:szCs w:val="16"/>
+                <w:shd w:fill="auto" w:val="clear"/>
                 <w:lang w:val="pt-BR" w:eastAsia="en-US" w:bidi="ar-SA"/>
               </w:rPr>
               <w:t>741</w:t>
@@ -3057,6 +3355,7 @@
                 <w:kern w:val="0"/>
                 <w:sz w:val="16"/>
                 <w:szCs w:val="16"/>
+                <w:shd w:fill="auto" w:val="clear"/>
                 <w:lang w:val="pt-BR" w:eastAsia="en-US" w:bidi="ar-SA"/>
               </w:rPr>
               <w:t xml:space="preserve">, </w:t>
@@ -3068,6 +3367,7 @@
                 <w:kern w:val="0"/>
                 <w:sz w:val="16"/>
                 <w:szCs w:val="16"/>
+                <w:shd w:fill="auto" w:val="clear"/>
                 <w:lang w:val="pt-BR" w:eastAsia="en-US" w:bidi="ar-SA"/>
               </w:rPr>
               <w:t>'Ameena Lynn'</w:t>
@@ -3079,6 +3379,7 @@
                 <w:kern w:val="0"/>
                 <w:sz w:val="16"/>
                 <w:szCs w:val="16"/>
+                <w:shd w:fill="auto" w:val="clear"/>
                 <w:lang w:val="pt-BR" w:eastAsia="en-US" w:bidi="ar-SA"/>
               </w:rPr>
               <w:t xml:space="preserve">, </w:t>
@@ -3090,6 +3391,7 @@
                 <w:kern w:val="0"/>
                 <w:sz w:val="16"/>
                 <w:szCs w:val="16"/>
+                <w:shd w:fill="auto" w:val="clear"/>
                 <w:lang w:val="pt-BR" w:eastAsia="en-US" w:bidi="ar-SA"/>
               </w:rPr>
               <w:t>0</w:t>
@@ -3101,6 +3403,7 @@
                 <w:kern w:val="0"/>
                 <w:sz w:val="16"/>
                 <w:szCs w:val="16"/>
+                <w:shd w:fill="auto" w:val="clear"/>
                 <w:lang w:val="pt-BR" w:eastAsia="en-US" w:bidi="ar-SA"/>
               </w:rPr>
               <w:t>)</w:t>
@@ -3112,6 +3415,7 @@
                 <w:kern w:val="0"/>
                 <w:sz w:val="16"/>
                 <w:szCs w:val="16"/>
+                <w:shd w:fill="auto" w:val="clear"/>
                 <w:lang w:val="pt-BR" w:eastAsia="en-US" w:bidi="ar-SA"/>
               </w:rPr>
               <w:t>;</w:t>
@@ -3120,13 +3424,15 @@
           <w:p>
             <w:pPr>
               <w:pStyle w:val="Normal"/>
-              <w:widowControl/>
+              <w:widowControl w:val="false"/>
+              <w:suppressAutoHyphens w:val="true"/>
               <w:spacing w:before="0" w:after="0"/>
               <w:jc w:val="left"/>
               <w:rPr>
                 <w:rFonts w:ascii="Consolas" w:hAnsi="Consolas" w:cs="Consolas"/>
                 <w:sz w:val="16"/>
                 <w:szCs w:val="16"/>
+                <w:shd w:fill="auto" w:val="clear"/>
               </w:rPr>
             </w:pPr>
             <w:r>
@@ -3138,6 +3444,7 @@
                 <w:kern w:val="0"/>
                 <w:sz w:val="16"/>
                 <w:szCs w:val="16"/>
+                <w:shd w:fill="auto" w:val="clear"/>
                 <w:lang w:val="pt-BR" w:eastAsia="en-US" w:bidi="ar-SA"/>
               </w:rPr>
               <w:t>INSERT</w:t>
@@ -3149,6 +3456,7 @@
                 <w:kern w:val="0"/>
                 <w:sz w:val="16"/>
                 <w:szCs w:val="16"/>
+                <w:shd w:fill="auto" w:val="clear"/>
                 <w:lang w:val="pt-BR" w:eastAsia="en-US" w:bidi="ar-SA"/>
               </w:rPr>
               <w:t xml:space="preserve"> </w:t>
@@ -3162,6 +3470,7 @@
                 <w:kern w:val="0"/>
                 <w:sz w:val="16"/>
                 <w:szCs w:val="16"/>
+                <w:shd w:fill="auto" w:val="clear"/>
                 <w:lang w:val="pt-BR" w:eastAsia="en-US" w:bidi="ar-SA"/>
               </w:rPr>
               <w:t>INTO</w:t>
@@ -3173,6 +3482,7 @@
                 <w:kern w:val="0"/>
                 <w:sz w:val="16"/>
                 <w:szCs w:val="16"/>
+                <w:shd w:fill="auto" w:val="clear"/>
                 <w:lang w:val="pt-BR" w:eastAsia="en-US" w:bidi="ar-SA"/>
               </w:rPr>
               <w:t xml:space="preserve"> contacorrente(idcontacorrente, numero, nome, ativo) </w:t>
@@ -3186,6 +3496,7 @@
                 <w:kern w:val="0"/>
                 <w:sz w:val="16"/>
                 <w:szCs w:val="16"/>
+                <w:shd w:fill="auto" w:val="clear"/>
                 <w:lang w:val="pt-BR" w:eastAsia="en-US" w:bidi="ar-SA"/>
               </w:rPr>
               <w:t>VALUES</w:t>
@@ -3197,6 +3508,7 @@
                 <w:kern w:val="0"/>
                 <w:sz w:val="16"/>
                 <w:szCs w:val="16"/>
+                <w:shd w:fill="auto" w:val="clear"/>
                 <w:lang w:val="pt-BR" w:eastAsia="en-US" w:bidi="ar-SA"/>
               </w:rPr>
               <w:t>(</w:t>
@@ -3208,6 +3520,7 @@
                 <w:kern w:val="0"/>
                 <w:sz w:val="16"/>
                 <w:szCs w:val="16"/>
+                <w:shd w:fill="auto" w:val="clear"/>
                 <w:lang w:val="pt-BR" w:eastAsia="en-US" w:bidi="ar-SA"/>
               </w:rPr>
               <w:t>'BCDACA4A-7067-ED11-AF81-825DFA4A16C9'</w:t>
@@ -3219,6 +3532,7 @@
                 <w:kern w:val="0"/>
                 <w:sz w:val="16"/>
                 <w:szCs w:val="16"/>
+                <w:shd w:fill="auto" w:val="clear"/>
                 <w:lang w:val="pt-BR" w:eastAsia="en-US" w:bidi="ar-SA"/>
               </w:rPr>
               <w:t xml:space="preserve">, </w:t>
@@ -3230,6 +3544,7 @@
                 <w:kern w:val="0"/>
                 <w:sz w:val="16"/>
                 <w:szCs w:val="16"/>
+                <w:shd w:fill="auto" w:val="clear"/>
                 <w:lang w:val="pt-BR" w:eastAsia="en-US" w:bidi="ar-SA"/>
               </w:rPr>
               <w:t>852</w:t>
@@ -3241,6 +3556,7 @@
                 <w:kern w:val="0"/>
                 <w:sz w:val="16"/>
                 <w:szCs w:val="16"/>
+                <w:shd w:fill="auto" w:val="clear"/>
                 <w:lang w:val="pt-BR" w:eastAsia="en-US" w:bidi="ar-SA"/>
               </w:rPr>
               <w:t xml:space="preserve">, </w:t>
@@ -3252,6 +3568,7 @@
                 <w:kern w:val="0"/>
                 <w:sz w:val="16"/>
                 <w:szCs w:val="16"/>
+                <w:shd w:fill="auto" w:val="clear"/>
                 <w:lang w:val="pt-BR" w:eastAsia="en-US" w:bidi="ar-SA"/>
               </w:rPr>
               <w:t>'Jarrad Mckee'</w:t>
@@ -3263,6 +3580,7 @@
                 <w:kern w:val="0"/>
                 <w:sz w:val="16"/>
                 <w:szCs w:val="16"/>
+                <w:shd w:fill="auto" w:val="clear"/>
                 <w:lang w:val="pt-BR" w:eastAsia="en-US" w:bidi="ar-SA"/>
               </w:rPr>
               <w:t xml:space="preserve">, </w:t>
@@ -3274,6 +3592,7 @@
                 <w:kern w:val="0"/>
                 <w:sz w:val="16"/>
                 <w:szCs w:val="16"/>
+                <w:shd w:fill="auto" w:val="clear"/>
                 <w:lang w:val="pt-BR" w:eastAsia="en-US" w:bidi="ar-SA"/>
               </w:rPr>
               <w:t>0</w:t>
@@ -3285,6 +3604,7 @@
                 <w:kern w:val="0"/>
                 <w:sz w:val="16"/>
                 <w:szCs w:val="16"/>
+                <w:shd w:fill="auto" w:val="clear"/>
                 <w:lang w:val="pt-BR" w:eastAsia="en-US" w:bidi="ar-SA"/>
               </w:rPr>
               <w:t>)</w:t>
@@ -3296,6 +3616,7 @@
                 <w:kern w:val="0"/>
                 <w:sz w:val="16"/>
                 <w:szCs w:val="16"/>
+                <w:shd w:fill="auto" w:val="clear"/>
                 <w:lang w:val="pt-BR" w:eastAsia="en-US" w:bidi="ar-SA"/>
               </w:rPr>
               <w:t>;</w:t>
@@ -3304,13 +3625,15 @@
           <w:p>
             <w:pPr>
               <w:pStyle w:val="Normal"/>
-              <w:widowControl/>
+              <w:widowControl w:val="false"/>
+              <w:suppressAutoHyphens w:val="true"/>
               <w:spacing w:before="0" w:after="0"/>
               <w:jc w:val="left"/>
               <w:rPr>
                 <w:rFonts w:ascii="Consolas" w:hAnsi="Consolas" w:cs="Consolas"/>
                 <w:sz w:val="16"/>
                 <w:szCs w:val="16"/>
+                <w:shd w:fill="auto" w:val="clear"/>
               </w:rPr>
             </w:pPr>
             <w:r>
@@ -3322,6 +3645,7 @@
                 <w:kern w:val="0"/>
                 <w:sz w:val="16"/>
                 <w:szCs w:val="16"/>
+                <w:shd w:fill="auto" w:val="clear"/>
                 <w:lang w:val="pt-BR" w:eastAsia="en-US" w:bidi="ar-SA"/>
               </w:rPr>
               <w:t>INSERT</w:t>
@@ -3333,6 +3657,7 @@
                 <w:kern w:val="0"/>
                 <w:sz w:val="16"/>
                 <w:szCs w:val="16"/>
+                <w:shd w:fill="auto" w:val="clear"/>
                 <w:lang w:val="pt-BR" w:eastAsia="en-US" w:bidi="ar-SA"/>
               </w:rPr>
               <w:t xml:space="preserve"> </w:t>
@@ -3346,6 +3671,7 @@
                 <w:kern w:val="0"/>
                 <w:sz w:val="16"/>
                 <w:szCs w:val="16"/>
+                <w:shd w:fill="auto" w:val="clear"/>
                 <w:lang w:val="pt-BR" w:eastAsia="en-US" w:bidi="ar-SA"/>
               </w:rPr>
               <w:t>INTO</w:t>
@@ -3357,6 +3683,7 @@
                 <w:kern w:val="0"/>
                 <w:sz w:val="16"/>
                 <w:szCs w:val="16"/>
+                <w:shd w:fill="auto" w:val="clear"/>
                 <w:lang w:val="pt-BR" w:eastAsia="en-US" w:bidi="ar-SA"/>
               </w:rPr>
               <w:t xml:space="preserve"> contacorrente(idcontacorrente, numero, nome, ativo) </w:t>
@@ -3370,6 +3697,7 @@
                 <w:kern w:val="0"/>
                 <w:sz w:val="16"/>
                 <w:szCs w:val="16"/>
+                <w:shd w:fill="auto" w:val="clear"/>
                 <w:lang w:val="pt-BR" w:eastAsia="en-US" w:bidi="ar-SA"/>
               </w:rPr>
               <w:t>VALUES</w:t>
@@ -3381,6 +3709,7 @@
                 <w:kern w:val="0"/>
                 <w:sz w:val="16"/>
                 <w:szCs w:val="16"/>
+                <w:shd w:fill="auto" w:val="clear"/>
                 <w:lang w:val="pt-BR" w:eastAsia="en-US" w:bidi="ar-SA"/>
               </w:rPr>
               <w:t>(</w:t>
@@ -3392,6 +3721,7 @@
                 <w:kern w:val="0"/>
                 <w:sz w:val="16"/>
                 <w:szCs w:val="16"/>
+                <w:shd w:fill="auto" w:val="clear"/>
                 <w:lang w:val="pt-BR" w:eastAsia="en-US" w:bidi="ar-SA"/>
               </w:rPr>
               <w:t>'D2E02051-7067-ED11-94C0-835DFA4A16C9'</w:t>
@@ -3403,6 +3733,7 @@
                 <w:kern w:val="0"/>
                 <w:sz w:val="16"/>
                 <w:szCs w:val="16"/>
+                <w:shd w:fill="auto" w:val="clear"/>
                 <w:lang w:val="pt-BR" w:eastAsia="en-US" w:bidi="ar-SA"/>
               </w:rPr>
               <w:t xml:space="preserve">, </w:t>
@@ -3414,6 +3745,7 @@
                 <w:kern w:val="0"/>
                 <w:sz w:val="16"/>
                 <w:szCs w:val="16"/>
+                <w:shd w:fill="auto" w:val="clear"/>
                 <w:lang w:val="pt-BR" w:eastAsia="en-US" w:bidi="ar-SA"/>
               </w:rPr>
               <w:t>963</w:t>
@@ -3425,6 +3757,7 @@
                 <w:kern w:val="0"/>
                 <w:sz w:val="16"/>
                 <w:szCs w:val="16"/>
+                <w:shd w:fill="auto" w:val="clear"/>
                 <w:lang w:val="pt-BR" w:eastAsia="en-US" w:bidi="ar-SA"/>
               </w:rPr>
               <w:t xml:space="preserve">, </w:t>
@@ -3436,6 +3769,7 @@
                 <w:kern w:val="0"/>
                 <w:sz w:val="16"/>
                 <w:szCs w:val="16"/>
+                <w:shd w:fill="auto" w:val="clear"/>
                 <w:lang w:val="pt-BR" w:eastAsia="en-US" w:bidi="ar-SA"/>
               </w:rPr>
               <w:t>'Elisha Simons'</w:t>
@@ -3447,6 +3781,7 @@
                 <w:kern w:val="0"/>
                 <w:sz w:val="16"/>
                 <w:szCs w:val="16"/>
+                <w:shd w:fill="auto" w:val="clear"/>
                 <w:lang w:val="pt-BR" w:eastAsia="en-US" w:bidi="ar-SA"/>
               </w:rPr>
               <w:t xml:space="preserve">, </w:t>
@@ -3458,6 +3793,7 @@
                 <w:kern w:val="0"/>
                 <w:sz w:val="16"/>
                 <w:szCs w:val="16"/>
+                <w:shd w:fill="auto" w:val="clear"/>
                 <w:lang w:val="pt-BR" w:eastAsia="en-US" w:bidi="ar-SA"/>
               </w:rPr>
               <w:t>0</w:t>
@@ -3469,6 +3805,7 @@
                 <w:kern w:val="0"/>
                 <w:sz w:val="16"/>
                 <w:szCs w:val="16"/>
+                <w:shd w:fill="auto" w:val="clear"/>
                 <w:lang w:val="pt-BR" w:eastAsia="en-US" w:bidi="ar-SA"/>
               </w:rPr>
               <w:t>)</w:t>
@@ -3480,6 +3817,7 @@
                 <w:kern w:val="0"/>
                 <w:sz w:val="16"/>
                 <w:szCs w:val="16"/>
+                <w:shd w:fill="auto" w:val="clear"/>
                 <w:lang w:val="pt-BR" w:eastAsia="en-US" w:bidi="ar-SA"/>
               </w:rPr>
               <w:t>;</w:t>
@@ -3491,19 +3829,27 @@
     <w:p>
       <w:pPr>
         <w:pStyle w:val="Normal"/>
-        <w:rPr/>
-      </w:pPr>
-      <w:r>
-        <w:rPr/>
+        <w:rPr>
+          <w:shd w:fill="auto" w:val="clear"/>
+        </w:rPr>
+      </w:pPr>
+      <w:r>
+        <w:rPr>
+          <w:shd w:fill="auto" w:val="clear"/>
+        </w:rPr>
       </w:r>
     </w:p>
     <w:p>
       <w:pPr>
         <w:pStyle w:val="Normal"/>
-        <w:rPr/>
-      </w:pPr>
-      <w:r>
-        <w:rPr/>
+        <w:rPr>
+          <w:shd w:fill="auto" w:val="clear"/>
+        </w:rPr>
+      </w:pPr>
+      <w:r>
+        <w:rPr>
+          <w:shd w:fill="auto" w:val="clear"/>
+        </w:rPr>
         <w:t>Observação:</w:t>
       </w:r>
     </w:p>
@@ -3514,110 +3860,158 @@
           <w:ilvl w:val="0"/>
           <w:numId w:val="2"/>
         </w:numPr>
-        <w:rPr/>
-      </w:pPr>
-      <w:r>
-        <w:rPr/>
+        <w:rPr>
+          <w:shd w:fill="auto" w:val="clear"/>
+        </w:rPr>
+      </w:pPr>
+      <w:r>
+        <w:rPr>
+          <w:shd w:fill="auto" w:val="clear"/>
+        </w:rPr>
         <w:t>Como o objetivo da API não é cadastrar contas, as contas correntes já foram inseridas via script.</w:t>
       </w:r>
     </w:p>
     <w:p>
       <w:pPr>
         <w:pStyle w:val="Normal"/>
-        <w:rPr/>
-      </w:pPr>
-      <w:r>
-        <w:rPr/>
+        <w:rPr>
+          <w:shd w:fill="auto" w:val="clear"/>
+        </w:rPr>
+      </w:pPr>
+      <w:r>
+        <w:rPr>
+          <w:shd w:fill="auto" w:val="clear"/>
+        </w:rPr>
       </w:r>
     </w:p>
     <w:p>
       <w:pPr>
         <w:pStyle w:val="Normal"/>
-        <w:rPr/>
-      </w:pPr>
-      <w:r>
-        <w:rPr/>
+        <w:rPr>
+          <w:shd w:fill="auto" w:val="clear"/>
+        </w:rPr>
+      </w:pPr>
+      <w:r>
+        <w:rPr>
+          <w:shd w:fill="auto" w:val="clear"/>
+        </w:rPr>
       </w:r>
     </w:p>
     <w:p>
       <w:pPr>
         <w:pStyle w:val="Normal"/>
-        <w:rPr/>
-      </w:pPr>
-      <w:r>
-        <w:rPr/>
+        <w:rPr>
+          <w:shd w:fill="auto" w:val="clear"/>
+        </w:rPr>
+      </w:pPr>
+      <w:r>
+        <w:rPr>
+          <w:shd w:fill="auto" w:val="clear"/>
+        </w:rPr>
       </w:r>
     </w:p>
     <w:p>
       <w:pPr>
         <w:pStyle w:val="Normal"/>
-        <w:rPr/>
-      </w:pPr>
-      <w:r>
-        <w:rPr/>
+        <w:rPr>
+          <w:shd w:fill="auto" w:val="clear"/>
+        </w:rPr>
+      </w:pPr>
+      <w:r>
+        <w:rPr>
+          <w:shd w:fill="auto" w:val="clear"/>
+        </w:rPr>
       </w:r>
     </w:p>
     <w:p>
       <w:pPr>
         <w:pStyle w:val="Normal"/>
-        <w:rPr/>
-      </w:pPr>
-      <w:r>
-        <w:rPr/>
+        <w:rPr>
+          <w:shd w:fill="auto" w:val="clear"/>
+        </w:rPr>
+      </w:pPr>
+      <w:r>
+        <w:rPr>
+          <w:shd w:fill="auto" w:val="clear"/>
+        </w:rPr>
       </w:r>
     </w:p>
     <w:p>
       <w:pPr>
         <w:pStyle w:val="Normal"/>
-        <w:rPr/>
-      </w:pPr>
-      <w:r>
-        <w:rPr/>
+        <w:rPr>
+          <w:shd w:fill="auto" w:val="clear"/>
+        </w:rPr>
+      </w:pPr>
+      <w:r>
+        <w:rPr>
+          <w:shd w:fill="auto" w:val="clear"/>
+        </w:rPr>
       </w:r>
     </w:p>
     <w:p>
       <w:pPr>
         <w:pStyle w:val="Normal"/>
-        <w:rPr/>
-      </w:pPr>
-      <w:r>
-        <w:rPr/>
+        <w:rPr>
+          <w:shd w:fill="auto" w:val="clear"/>
+        </w:rPr>
+      </w:pPr>
+      <w:r>
+        <w:rPr>
+          <w:shd w:fill="auto" w:val="clear"/>
+        </w:rPr>
       </w:r>
     </w:p>
     <w:p>
       <w:pPr>
         <w:pStyle w:val="Normal"/>
-        <w:rPr/>
-      </w:pPr>
-      <w:r>
-        <w:rPr/>
+        <w:rPr>
+          <w:shd w:fill="auto" w:val="clear"/>
+        </w:rPr>
+      </w:pPr>
+      <w:r>
+        <w:rPr>
+          <w:shd w:fill="auto" w:val="clear"/>
+        </w:rPr>
       </w:r>
     </w:p>
     <w:p>
       <w:pPr>
         <w:pStyle w:val="Normal"/>
-        <w:rPr/>
-      </w:pPr>
-      <w:r>
-        <w:rPr/>
+        <w:rPr>
+          <w:shd w:fill="auto" w:val="clear"/>
+        </w:rPr>
+      </w:pPr>
+      <w:r>
+        <w:rPr>
+          <w:shd w:fill="auto" w:val="clear"/>
+        </w:rPr>
       </w:r>
     </w:p>
     <w:p>
       <w:pPr>
         <w:pStyle w:val="Normal"/>
-        <w:rPr/>
-      </w:pPr>
-      <w:r>
-        <w:rPr/>
+        <w:rPr>
+          <w:shd w:fill="auto" w:val="clear"/>
+        </w:rPr>
+      </w:pPr>
+      <w:r>
+        <w:rPr>
+          <w:shd w:fill="auto" w:val="clear"/>
+        </w:rPr>
       </w:r>
     </w:p>
     <w:p>
       <w:pPr>
         <w:pStyle w:val="Normal"/>
-        <w:rPr/>
-      </w:pPr>
-      <w:r>
-        <w:rPr/>
+        <w:rPr>
+          <w:shd w:fill="auto" w:val="clear"/>
+        </w:rPr>
+      </w:pPr>
+      <w:r>
+        <w:rPr>
+          <w:shd w:fill="auto" w:val="clear"/>
+        </w:rPr>
         <w:t>As APIs da empresa geralmente utilizam:</w:t>
       </w:r>
     </w:p>
@@ -3628,13 +4022,15 @@
           <w:ilvl w:val="0"/>
           <w:numId w:val="2"/>
         </w:numPr>
-        <w:rPr/>
+        <w:rPr>
+          <w:shd w:fill="auto" w:val="clear"/>
+        </w:rPr>
       </w:pPr>
       <w:r>
         <w:rPr>
           <w:b/>
           <w:bCs/>
-          <w:shd w:fill="FFFF00" w:val="clear"/>
+          <w:shd w:fill="auto" w:val="clear"/>
         </w:rPr>
         <w:t>Dapper</w:t>
       </w:r>
@@ -3642,11 +4038,14 @@
         <w:rPr>
           <w:b/>
           <w:bCs/>
+          <w:shd w:fill="auto" w:val="clear"/>
         </w:rPr>
         <w:t xml:space="preserve"> </w:t>
       </w:r>
       <w:r>
-        <w:rPr/>
+        <w:rPr>
+          <w:shd w:fill="auto" w:val="clear"/>
+        </w:rPr>
         <w:t>– Componente para conexão com o banco de dados.</w:t>
       </w:r>
     </w:p>
@@ -3658,20 +4057,21 @@
           <w:numId w:val="2"/>
         </w:numPr>
         <w:rPr>
-          <w:lang w:val="en-US"/>
+          <w:shd w:fill="auto" w:val="clear"/>
         </w:rPr>
       </w:pPr>
       <w:r>
         <w:rPr>
           <w:b/>
           <w:bCs/>
-          <w:shd w:fill="FFFF00" w:val="clear"/>
+          <w:shd w:fill="auto" w:val="clear"/>
           <w:lang w:val="en-US"/>
         </w:rPr>
         <w:t>CQRS</w:t>
       </w:r>
       <w:r>
         <w:rPr>
+          <w:shd w:fill="auto" w:val="clear"/>
           <w:lang w:val="en-US"/>
         </w:rPr>
         <w:t xml:space="preserve"> - Command Query Responsibility Segregation;</w:t>
@@ -3684,18 +4084,22 @@
           <w:ilvl w:val="0"/>
           <w:numId w:val="2"/>
         </w:numPr>
-        <w:rPr/>
+        <w:rPr>
+          <w:shd w:fill="auto" w:val="clear"/>
+        </w:rPr>
       </w:pPr>
       <w:r>
         <w:rPr>
           <w:b/>
           <w:bCs/>
-          <w:shd w:fill="FFFF00" w:val="clear"/>
+          <w:shd w:fill="auto" w:val="clear"/>
         </w:rPr>
         <w:t>Mediator</w:t>
       </w:r>
       <w:r>
-        <w:rPr/>
+        <w:rPr>
+          <w:shd w:fill="auto" w:val="clear"/>
+        </w:rPr>
         <w:t xml:space="preserve"> - Padrão de projeto comportamental que permite que você reduza as dependências caóticas entre objetos;</w:t>
       </w:r>
     </w:p>
@@ -3706,18 +4110,22 @@
           <w:ilvl w:val="0"/>
           <w:numId w:val="2"/>
         </w:numPr>
-        <w:rPr/>
+        <w:rPr>
+          <w:shd w:fill="auto" w:val="clear"/>
+        </w:rPr>
       </w:pPr>
       <w:r>
         <w:rPr>
           <w:b/>
           <w:bCs/>
-          <w:shd w:fill="FFFF00" w:val="clear"/>
+          <w:shd w:fill="auto" w:val="clear"/>
         </w:rPr>
         <w:t>Swagger</w:t>
       </w:r>
       <w:r>
-        <w:rPr/>
+        <w:rPr>
+          <w:shd w:fill="auto" w:val="clear"/>
+        </w:rPr>
         <w:t xml:space="preserve"> – Todos os serviços são documentados usando Swagger, todos os atributos são documentados, todos as requisições e retornos possíveis são documentados e com exemplos.</w:t>
       </w:r>
     </w:p>
@@ -3728,7 +4136,9 @@
           <w:ilvl w:val="0"/>
           <w:numId w:val="2"/>
         </w:numPr>
-        <w:rPr/>
+        <w:rPr>
+          <w:shd w:fill="auto" w:val="clear"/>
+        </w:rPr>
       </w:pPr>
       <w:r>
         <w:rPr>
@@ -3742,254 +4152,328 @@
         <w:rPr>
           <w:b/>
           <w:bCs/>
+          <w:shd w:fill="FFFF00" w:val="clear"/>
         </w:rPr>
         <w:t xml:space="preserve"> </w:t>
       </w:r>
       <w:r>
-        <w:rPr/>
+        <w:rPr>
+          <w:shd w:fill="auto" w:val="clear"/>
+        </w:rPr>
         <w:t>– Para garantir a qualidade, a empresa costuma implementar testes unitários, as integrações e bancos de dados são normalmente mockados, geralmente usando NSubstitute.</w:t>
       </w:r>
     </w:p>
     <w:p>
       <w:pPr>
         <w:pStyle w:val="Normal"/>
-        <w:rPr/>
-      </w:pPr>
-      <w:r>
-        <w:rPr/>
+        <w:rPr>
+          <w:shd w:fill="auto" w:val="clear"/>
+        </w:rPr>
+      </w:pPr>
+      <w:r>
+        <w:rPr>
+          <w:shd w:fill="auto" w:val="clear"/>
+        </w:rPr>
       </w:r>
     </w:p>
     <w:p>
       <w:pPr>
         <w:pStyle w:val="Normal"/>
-        <w:rPr/>
-      </w:pPr>
-      <w:r>
-        <w:rPr/>
+        <w:rPr>
+          <w:shd w:fill="auto" w:val="clear"/>
+        </w:rPr>
+      </w:pPr>
+      <w:r>
+        <w:rPr>
+          <w:shd w:fill="auto" w:val="clear"/>
+        </w:rPr>
         <w:t xml:space="preserve">Para este teste </w:t>
       </w:r>
       <w:r>
         <w:rPr>
           <w:u w:val="single"/>
+          <w:shd w:fill="auto" w:val="clear"/>
         </w:rPr>
         <w:t>não é obrigatório utilizar esses padrões e tecnologias</w:t>
       </w:r>
       <w:r>
-        <w:rPr/>
+        <w:rPr>
+          <w:shd w:fill="auto" w:val="clear"/>
+        </w:rPr>
         <w:t xml:space="preserve">, mas se você conhecer e puder utilizar contará </w:t>
       </w:r>
       <w:r>
         <w:rPr>
           <w:u w:val="single"/>
+          <w:shd w:fill="auto" w:val="clear"/>
         </w:rPr>
         <w:t>pontos extras na avaliação</w:t>
       </w:r>
       <w:r>
-        <w:rPr/>
+        <w:rPr>
+          <w:shd w:fill="auto" w:val="clear"/>
+        </w:rPr>
         <w:t>.</w:t>
       </w:r>
     </w:p>
     <w:p>
       <w:pPr>
         <w:pStyle w:val="Normal"/>
-        <w:rPr/>
-      </w:pPr>
-      <w:r>
-        <w:rPr/>
+        <w:rPr>
+          <w:shd w:fill="auto" w:val="clear"/>
+        </w:rPr>
+      </w:pPr>
+      <w:r>
+        <w:rPr>
+          <w:shd w:fill="auto" w:val="clear"/>
+        </w:rPr>
       </w:r>
     </w:p>
     <w:p>
       <w:pPr>
         <w:pStyle w:val="Normal"/>
         <w:rPr>
-          <w:b/>
+          <w:shd w:fill="auto" w:val="clear"/>
+        </w:rPr>
+      </w:pPr>
+      <w:r>
+        <w:rPr>
           <w:b/>
           <w:bCs/>
           <w:sz w:val="28"/>
           <w:szCs w:val="28"/>
-        </w:rPr>
-      </w:pPr>
+          <w:shd w:fill="auto" w:val="clear"/>
+        </w:rPr>
+        <w:t>Serviço: Movimentação de uma conta corrente</w:t>
+      </w:r>
+    </w:p>
+    <w:p>
+      <w:pPr>
+        <w:pStyle w:val="Normal"/>
+        <w:rPr>
+          <w:shd w:fill="auto" w:val="clear"/>
+        </w:rPr>
+      </w:pPr>
+      <w:r>
+        <w:rPr>
+          <w:shd w:fill="auto" w:val="clear"/>
+        </w:rPr>
+      </w:r>
+    </w:p>
+    <w:p>
+      <w:pPr>
+        <w:pStyle w:val="Normal"/>
+        <w:rPr>
+          <w:shd w:fill="auto" w:val="clear"/>
+        </w:rPr>
+      </w:pPr>
+      <w:r>
+        <w:rPr>
+          <w:shd w:fill="auto" w:val="clear"/>
+        </w:rPr>
+        <w:t xml:space="preserve">Um </w:t>
+      </w:r>
       <w:r>
         <w:rPr>
           <w:b/>
           <w:bCs/>
-          <w:sz w:val="28"/>
-          <w:szCs w:val="28"/>
-        </w:rPr>
-        <w:t>Serviço: Movimentação de uma conta corrente</w:t>
+          <w:shd w:fill="auto" w:val="clear"/>
+        </w:rPr>
+        <w:t>aplicativo</w:t>
+      </w:r>
+      <w:r>
+        <w:rPr>
+          <w:shd w:fill="auto" w:val="clear"/>
+        </w:rPr>
+        <w:t xml:space="preserve"> da empresa necessita se integrar com esta API que você vai construir para movimentar a conta corrente.</w:t>
       </w:r>
     </w:p>
     <w:p>
       <w:pPr>
         <w:pStyle w:val="Normal"/>
-        <w:rPr/>
-      </w:pPr>
-      <w:r>
-        <w:rPr/>
+        <w:rPr>
+          <w:shd w:fill="auto" w:val="clear"/>
+        </w:rPr>
+      </w:pPr>
+      <w:r>
+        <w:rPr>
+          <w:shd w:fill="auto" w:val="clear"/>
+        </w:rPr>
       </w:r>
     </w:p>
     <w:p>
       <w:pPr>
         <w:pStyle w:val="Normal"/>
-        <w:rPr/>
-      </w:pPr>
-      <w:r>
-        <w:rPr/>
-        <w:t xml:space="preserve">Um </w:t>
+        <w:rPr>
+          <w:strike/>
+          <w:shd w:fill="auto" w:val="clear"/>
+        </w:rPr>
+      </w:pPr>
+      <w:r>
+        <w:rPr>
+          <w:strike/>
+          <w:shd w:fill="auto" w:val="clear"/>
+        </w:rPr>
+        <w:t xml:space="preserve">O novo serviço deve requisitar a </w:t>
       </w:r>
       <w:r>
         <w:rPr>
           <w:b/>
           <w:bCs/>
-        </w:rPr>
-        <w:t>aplicativo</w:t>
-      </w:r>
-      <w:r>
-        <w:rPr/>
-        <w:t xml:space="preserve"> da empresa necessita se integrar com esta API que você vai construir para movimentar a conta corrente.</w:t>
-      </w:r>
-    </w:p>
-    <w:p>
-      <w:pPr>
-        <w:pStyle w:val="Normal"/>
-        <w:rPr/>
-      </w:pPr>
-      <w:r>
-        <w:rPr/>
-      </w:r>
-    </w:p>
-    <w:p>
-      <w:pPr>
-        <w:pStyle w:val="Normal"/>
-        <w:rPr/>
-      </w:pPr>
-      <w:r>
-        <w:rPr/>
-        <w:t xml:space="preserve">O novo serviço deve requisitar a </w:t>
+          <w:strike/>
+          <w:shd w:fill="auto" w:val="clear"/>
+        </w:rPr>
+        <w:t>identificação da requisição</w:t>
+      </w:r>
+      <w:r>
+        <w:rPr>
+          <w:strike/>
+          <w:shd w:fill="auto" w:val="clear"/>
+        </w:rPr>
+        <w:t xml:space="preserve">, </w:t>
       </w:r>
       <w:r>
         <w:rPr>
           <w:b/>
           <w:bCs/>
-          <w:shd w:fill="FFFF00" w:val="clear"/>
-        </w:rPr>
-        <w:t>identificação da requisição</w:t>
-      </w:r>
-      <w:r>
-        <w:rPr>
-          <w:shd w:fill="FFFF00" w:val="clear"/>
-        </w:rPr>
-        <w:t xml:space="preserve">, </w:t>
+          <w:strike/>
+          <w:shd w:fill="auto" w:val="clear"/>
+        </w:rPr>
+        <w:t>identificação da conta corrente</w:t>
+      </w:r>
+      <w:r>
+        <w:rPr>
+          <w:strike/>
+          <w:shd w:fill="auto" w:val="clear"/>
+        </w:rPr>
+        <w:t xml:space="preserve">, o </w:t>
       </w:r>
       <w:r>
         <w:rPr>
           <w:b/>
           <w:bCs/>
-          <w:shd w:fill="FFFF00" w:val="clear"/>
-        </w:rPr>
-        <w:t>identificação da conta corrente</w:t>
-      </w:r>
-      <w:r>
-        <w:rPr>
-          <w:shd w:fill="FFFF00" w:val="clear"/>
-        </w:rPr>
-        <w:t xml:space="preserve">, o </w:t>
+          <w:strike/>
+          <w:shd w:fill="auto" w:val="clear"/>
+        </w:rPr>
+        <w:t>valor a ser movimentado</w:t>
+      </w:r>
+      <w:r>
+        <w:rPr>
+          <w:strike/>
+          <w:shd w:fill="auto" w:val="clear"/>
+        </w:rPr>
+        <w:t xml:space="preserve">, e o </w:t>
       </w:r>
       <w:r>
         <w:rPr>
           <w:b/>
           <w:bCs/>
-          <w:shd w:fill="FFFF00" w:val="clear"/>
-        </w:rPr>
-        <w:t>valor a ser movimentado</w:t>
-      </w:r>
-      <w:r>
-        <w:rPr/>
-        <w:t xml:space="preserve">, e o </w:t>
+          <w:strike/>
+          <w:shd w:fill="auto" w:val="clear"/>
+        </w:rPr>
+        <w:t>tipo de movimento</w:t>
+      </w:r>
+      <w:r>
+        <w:rPr>
+          <w:strike/>
+          <w:shd w:fill="auto" w:val="clear"/>
+        </w:rPr>
+        <w:t xml:space="preserve"> (C = Credito, D = Débito).</w:t>
+      </w:r>
+    </w:p>
+    <w:p>
+      <w:pPr>
+        <w:pStyle w:val="Normal"/>
+        <w:rPr>
+          <w:shd w:fill="auto" w:val="clear"/>
+        </w:rPr>
+      </w:pPr>
+      <w:r>
+        <w:rPr>
+          <w:shd w:fill="auto" w:val="clear"/>
+        </w:rPr>
+      </w:r>
+    </w:p>
+    <w:p>
+      <w:pPr>
+        <w:pStyle w:val="Normal"/>
+        <w:rPr>
+          <w:shd w:fill="auto" w:val="clear"/>
+        </w:rPr>
+      </w:pPr>
+      <w:r>
+        <w:rPr>
+          <w:shd w:fill="auto" w:val="clear"/>
+        </w:rPr>
+        <w:t xml:space="preserve">É importante que a API seja resiliente a falhas, pois o </w:t>
       </w:r>
       <w:r>
         <w:rPr>
           <w:b/>
           <w:bCs/>
-          <w:shd w:fill="FFFF00" w:val="clear"/>
-        </w:rPr>
-        <w:t>tipo de movimento</w:t>
-      </w:r>
-      <w:r>
-        <w:rPr/>
-        <w:t xml:space="preserve"> (C = Credito, D = Débito).</w:t>
-      </w:r>
-    </w:p>
-    <w:p>
-      <w:pPr>
-        <w:pStyle w:val="Normal"/>
-        <w:rPr/>
-      </w:pPr>
-      <w:r>
-        <w:rPr/>
-      </w:r>
-    </w:p>
-    <w:p>
-      <w:pPr>
-        <w:pStyle w:val="Normal"/>
-        <w:rPr/>
-      </w:pPr>
-      <w:r>
-        <w:rPr/>
-        <w:t xml:space="preserve">É importante que a API seja resiliente a falhas, pois o </w:t>
+          <w:shd w:fill="auto" w:val="clear"/>
+        </w:rPr>
+        <w:t>aplicativo</w:t>
+      </w:r>
+      <w:r>
+        <w:rPr>
+          <w:shd w:fill="auto" w:val="clear"/>
+        </w:rPr>
+        <w:t xml:space="preserve"> que utiliza a API pode perder a conexão com a API antes de receber a resposta e então nestes casos o comportamento é repetir a mesma requisição até que o aplicativo receba um retorno. Para tornar o serviço seguro, pode-se criar o conceito de </w:t>
       </w:r>
       <w:r>
         <w:rPr>
           <w:b/>
           <w:bCs/>
-        </w:rPr>
-        <w:t>aplicativo</w:t>
-      </w:r>
-      <w:r>
-        <w:rPr/>
-        <w:t xml:space="preserve"> que utiliza a API pode perder a conexão com a API antes de receber a resposta e então nestes casos o comportamento é repetir a mesma requisição até que o aplicativo receba um retorno. Para tornar o serviço seguro, pode-se criar o conceito de </w:t>
+          <w:shd w:fill="auto" w:val="clear"/>
+        </w:rPr>
+        <w:t>Idempotência</w:t>
+      </w:r>
+      <w:r>
+        <w:rPr>
+          <w:shd w:fill="auto" w:val="clear"/>
+        </w:rPr>
+        <w:t xml:space="preserve"> que pode ser implementado por meio da </w:t>
       </w:r>
       <w:r>
         <w:rPr>
           <w:b/>
           <w:bCs/>
-          <w:shd w:fill="FFFF00" w:val="clear"/>
-        </w:rPr>
-        <w:t>Idempotência</w:t>
-      </w:r>
-      <w:r>
-        <w:rPr/>
-        <w:t xml:space="preserve"> que pode ser implementado por meio da </w:t>
-      </w:r>
-      <w:r>
-        <w:rPr>
-          <w:b/>
-          <w:bCs/>
-          <w:shd w:fill="FFFF00" w:val="clear"/>
+          <w:shd w:fill="auto" w:val="clear"/>
         </w:rPr>
         <w:t>identificação da requisição</w:t>
       </w:r>
       <w:r>
-        <w:rPr/>
+        <w:rPr>
+          <w:shd w:fill="auto" w:val="clear"/>
+        </w:rPr>
         <w:t>.</w:t>
       </w:r>
     </w:p>
     <w:p>
       <w:pPr>
         <w:pStyle w:val="Normal"/>
-        <w:rPr/>
-      </w:pPr>
-      <w:r>
-        <w:rPr/>
+        <w:rPr>
+          <w:shd w:fill="auto" w:val="clear"/>
+        </w:rPr>
+      </w:pPr>
+      <w:r>
+        <w:rPr>
+          <w:shd w:fill="auto" w:val="clear"/>
+        </w:rPr>
       </w:r>
     </w:p>
     <w:p>
       <w:pPr>
         <w:pStyle w:val="Normal"/>
-        <w:rPr/>
-      </w:pPr>
-      <w:r>
-        <w:rPr/>
+        <w:rPr>
+          <w:shd w:fill="auto" w:val="clear"/>
+        </w:rPr>
+      </w:pPr>
+      <w:r>
+        <w:rPr>
+          <w:shd w:fill="auto" w:val="clear"/>
+        </w:rPr>
         <w:t>O serviço deve realizar as seguintes validações de negócio:</w:t>
       </w:r>
     </w:p>
@@ -4000,20 +4484,26 @@
           <w:ilvl w:val="0"/>
           <w:numId w:val="3"/>
         </w:numPr>
-        <w:rPr/>
-      </w:pPr>
-      <w:r>
-        <w:rPr/>
+        <w:rPr>
+          <w:shd w:fill="auto" w:val="clear"/>
+        </w:rPr>
+      </w:pPr>
+      <w:r>
+        <w:rPr>
+          <w:shd w:fill="auto" w:val="clear"/>
+        </w:rPr>
         <w:t xml:space="preserve">Apenas contas correntes cadastradas podem receber movimentação; TIPO: </w:t>
       </w:r>
       <w:r>
         <w:rPr>
-          <w:shd w:fill="FFFF00" w:val="clear"/>
+          <w:shd w:fill="auto" w:val="clear"/>
         </w:rPr>
         <w:t>INVALID_ACCOUNT</w:t>
       </w:r>
       <w:r>
-        <w:rPr/>
+        <w:rPr>
+          <w:shd w:fill="auto" w:val="clear"/>
+        </w:rPr>
         <w:t>.</w:t>
       </w:r>
     </w:p>
@@ -4024,20 +4514,26 @@
           <w:ilvl w:val="0"/>
           <w:numId w:val="3"/>
         </w:numPr>
-        <w:rPr/>
-      </w:pPr>
-      <w:r>
-        <w:rPr/>
+        <w:rPr>
+          <w:shd w:fill="auto" w:val="clear"/>
+        </w:rPr>
+      </w:pPr>
+      <w:r>
+        <w:rPr>
+          <w:shd w:fill="auto" w:val="clear"/>
+        </w:rPr>
         <w:t xml:space="preserve">Apenas contas correntes ativas podem receber movimentação; TIPO: </w:t>
       </w:r>
       <w:r>
         <w:rPr>
-          <w:shd w:fill="FFFF00" w:val="clear"/>
+          <w:shd w:fill="auto" w:val="clear"/>
         </w:rPr>
         <w:t>INACTIVE_ACCOUNT</w:t>
       </w:r>
       <w:r>
-        <w:rPr/>
+        <w:rPr>
+          <w:shd w:fill="auto" w:val="clear"/>
+        </w:rPr>
         <w:t>.</w:t>
       </w:r>
     </w:p>
@@ -4048,20 +4544,26 @@
           <w:ilvl w:val="0"/>
           <w:numId w:val="3"/>
         </w:numPr>
-        <w:rPr/>
-      </w:pPr>
-      <w:r>
-        <w:rPr/>
+        <w:rPr>
+          <w:shd w:fill="auto" w:val="clear"/>
+        </w:rPr>
+      </w:pPr>
+      <w:r>
+        <w:rPr>
+          <w:shd w:fill="auto" w:val="clear"/>
+        </w:rPr>
         <w:t xml:space="preserve">Apenas valores positivos podem ser recebidos; TIPO: </w:t>
       </w:r>
       <w:r>
         <w:rPr>
-          <w:shd w:fill="FFFF00" w:val="clear"/>
+          <w:shd w:fill="auto" w:val="clear"/>
         </w:rPr>
         <w:t>INVALID_VALUE</w:t>
       </w:r>
       <w:r>
-        <w:rPr/>
+        <w:rPr>
+          <w:shd w:fill="auto" w:val="clear"/>
+        </w:rPr>
         <w:t>.</w:t>
       </w:r>
     </w:p>
@@ -4072,320 +4574,399 @@
           <w:ilvl w:val="0"/>
           <w:numId w:val="3"/>
         </w:numPr>
-        <w:rPr/>
-      </w:pPr>
-      <w:r>
-        <w:rPr/>
+        <w:rPr>
+          <w:shd w:fill="auto" w:val="clear"/>
+        </w:rPr>
+      </w:pPr>
+      <w:r>
+        <w:rPr>
+          <w:shd w:fill="auto" w:val="clear"/>
+        </w:rPr>
         <w:t xml:space="preserve">Apenas os tipos “débito” ou “crédito” podem ser aceitos; TIPO: </w:t>
       </w:r>
       <w:r>
         <w:rPr>
-          <w:shd w:fill="FFFF00" w:val="clear"/>
+          <w:shd w:fill="auto" w:val="clear"/>
         </w:rPr>
         <w:t>INVALID_TYPE</w:t>
       </w:r>
       <w:r>
-        <w:rPr/>
+        <w:rPr>
+          <w:shd w:fill="auto" w:val="clear"/>
+        </w:rPr>
         <w:t>.</w:t>
       </w:r>
     </w:p>
     <w:p>
       <w:pPr>
         <w:pStyle w:val="Normal"/>
-        <w:rPr/>
-      </w:pPr>
-      <w:r>
-        <w:rPr/>
+        <w:rPr>
+          <w:shd w:fill="auto" w:val="clear"/>
+        </w:rPr>
+      </w:pPr>
+      <w:r>
+        <w:rPr>
+          <w:shd w:fill="auto" w:val="clear"/>
+        </w:rPr>
       </w:r>
     </w:p>
     <w:p>
       <w:pPr>
         <w:pStyle w:val="Normal"/>
-        <w:rPr/>
-      </w:pPr>
-      <w:r>
-        <w:rPr/>
+        <w:rPr>
+          <w:shd w:fill="auto" w:val="clear"/>
+        </w:rPr>
+      </w:pPr>
+      <w:r>
+        <w:rPr>
+          <w:shd w:fill="auto" w:val="clear"/>
+        </w:rPr>
         <w:t xml:space="preserve">Caso os dados sejam recebidos e estejam válidos, devem ser </w:t>
       </w:r>
       <w:r>
         <w:rPr>
-          <w:shd w:fill="FFFF00" w:val="clear"/>
+          <w:shd w:fill="auto" w:val="clear"/>
         </w:rPr>
         <w:t>persistidos na tabela MOVIMENTO</w:t>
       </w:r>
       <w:r>
-        <w:rPr/>
+        <w:rPr>
+          <w:shd w:fill="auto" w:val="clear"/>
+        </w:rPr>
         <w:t xml:space="preserve"> e deve retornar </w:t>
       </w:r>
       <w:r>
         <w:rPr>
-          <w:shd w:fill="FFFF00" w:val="clear"/>
+          <w:shd w:fill="auto" w:val="clear"/>
         </w:rPr>
         <w:t>HTTP 200</w:t>
       </w:r>
       <w:r>
-        <w:rPr/>
+        <w:rPr>
+          <w:shd w:fill="auto" w:val="clear"/>
+        </w:rPr>
         <w:t xml:space="preserve"> e </w:t>
       </w:r>
       <w:r>
         <w:rPr>
-          <w:shd w:fill="FFFF00" w:val="clear"/>
+          <w:shd w:fill="auto" w:val="clear"/>
         </w:rPr>
         <w:t>retornar</w:t>
       </w:r>
       <w:r>
-        <w:rPr/>
+        <w:rPr>
+          <w:shd w:fill="auto" w:val="clear"/>
+        </w:rPr>
         <w:t xml:space="preserve"> no body </w:t>
       </w:r>
       <w:r>
         <w:rPr>
-          <w:shd w:fill="FFFF00" w:val="clear"/>
+          <w:shd w:fill="auto" w:val="clear"/>
         </w:rPr>
         <w:t>Id do movimento gerado</w:t>
       </w:r>
       <w:r>
-        <w:rPr/>
+        <w:rPr>
+          <w:shd w:fill="auto" w:val="clear"/>
+        </w:rPr>
         <w:t>.</w:t>
       </w:r>
     </w:p>
     <w:p>
       <w:pPr>
         <w:pStyle w:val="Normal"/>
-        <w:rPr/>
-      </w:pPr>
-      <w:r>
-        <w:rPr/>
+        <w:rPr>
+          <w:shd w:fill="auto" w:val="clear"/>
+        </w:rPr>
+      </w:pPr>
+      <w:r>
+        <w:rPr>
+          <w:shd w:fill="auto" w:val="clear"/>
+        </w:rPr>
       </w:r>
     </w:p>
     <w:p>
       <w:pPr>
         <w:pStyle w:val="Normal"/>
-        <w:rPr/>
-      </w:pPr>
-      <w:r>
-        <w:rPr/>
+        <w:rPr>
+          <w:shd w:fill="auto" w:val="clear"/>
+        </w:rPr>
+      </w:pPr>
+      <w:r>
+        <w:rPr>
+          <w:shd w:fill="auto" w:val="clear"/>
+        </w:rPr>
         <w:t xml:space="preserve">Caso os dados estejam inconsistentes, deve retornar falha </w:t>
       </w:r>
       <w:r>
         <w:rPr>
-          <w:shd w:fill="FFFF00" w:val="clear"/>
+          <w:shd w:fill="auto" w:val="clear"/>
         </w:rPr>
         <w:t>HTTP 400 (Bad Request)</w:t>
       </w:r>
       <w:r>
-        <w:rPr/>
+        <w:rPr>
+          <w:shd w:fill="auto" w:val="clear"/>
+        </w:rPr>
         <w:t xml:space="preserve"> e no body uma </w:t>
       </w:r>
       <w:r>
         <w:rPr>
-          <w:shd w:fill="FFFF00" w:val="clear"/>
-        </w:rPr>
-        <w:t xml:space="preserve">mensagem descritiva de qual foi a falha e o </w:t>
-      </w:r>
-      <w:r>
-        <w:rPr>
-          <w:shd w:fill="81D41A" w:val="clear"/>
-        </w:rPr>
-        <w:t>tipo de falha</w:t>
-      </w:r>
-      <w:r>
-        <w:rPr/>
+          <w:shd w:fill="auto" w:val="clear"/>
+        </w:rPr>
+        <w:t>mensagem descritiva de qual foi a falha e o tipo de falha</w:t>
+      </w:r>
+      <w:r>
+        <w:rPr>
+          <w:shd w:fill="auto" w:val="clear"/>
+        </w:rPr>
         <w:t>.</w:t>
       </w:r>
     </w:p>
     <w:p>
       <w:pPr>
         <w:pStyle w:val="Normal"/>
-        <w:rPr/>
-      </w:pPr>
-      <w:r>
-        <w:rPr/>
+        <w:rPr>
+          <w:shd w:fill="auto" w:val="clear"/>
+        </w:rPr>
+      </w:pPr>
+      <w:r>
+        <w:rPr>
+          <w:shd w:fill="auto" w:val="clear"/>
+        </w:rPr>
       </w:r>
     </w:p>
     <w:p>
       <w:pPr>
         <w:pStyle w:val="Normal"/>
         <w:rPr>
-          <w:b/>
+          <w:shd w:fill="auto" w:val="clear"/>
+        </w:rPr>
+      </w:pPr>
+      <w:r>
+        <w:rPr>
           <w:b/>
           <w:bCs/>
           <w:sz w:val="28"/>
           <w:szCs w:val="28"/>
-        </w:rPr>
-      </w:pPr>
+          <w:shd w:fill="auto" w:val="clear"/>
+        </w:rPr>
+        <w:t>Serviço: Saldo da conta corrente</w:t>
+      </w:r>
+    </w:p>
+    <w:p>
+      <w:pPr>
+        <w:pStyle w:val="Normal"/>
+        <w:rPr>
+          <w:shd w:fill="auto" w:val="clear"/>
+        </w:rPr>
+      </w:pPr>
+      <w:r>
+        <w:rPr>
+          <w:shd w:fill="auto" w:val="clear"/>
+        </w:rPr>
+      </w:r>
+    </w:p>
+    <w:p>
+      <w:pPr>
+        <w:pStyle w:val="Normal"/>
+        <w:rPr>
+          <w:shd w:fill="auto" w:val="clear"/>
+        </w:rPr>
+      </w:pPr>
+      <w:r>
+        <w:rPr>
+          <w:shd w:fill="auto" w:val="clear"/>
+        </w:rPr>
+        <w:t xml:space="preserve">O </w:t>
+      </w:r>
       <w:r>
         <w:rPr>
           <w:b/>
           <w:bCs/>
-          <w:sz w:val="28"/>
-          <w:szCs w:val="28"/>
-        </w:rPr>
-        <w:t>Serviço: Saldo da conta corrente</w:t>
+          <w:shd w:fill="auto" w:val="clear"/>
+        </w:rPr>
+        <w:t>aplicativo</w:t>
+      </w:r>
+      <w:r>
+        <w:rPr>
+          <w:shd w:fill="auto" w:val="clear"/>
+        </w:rPr>
+        <w:t xml:space="preserve"> da empresa necessita exibir o saldo atual da conta corrente.</w:t>
       </w:r>
     </w:p>
     <w:p>
       <w:pPr>
         <w:pStyle w:val="Normal"/>
-        <w:rPr/>
-      </w:pPr>
-      <w:r>
-        <w:rPr/>
+        <w:rPr>
+          <w:shd w:fill="auto" w:val="clear"/>
+        </w:rPr>
+      </w:pPr>
+      <w:r>
+        <w:rPr>
+          <w:shd w:fill="auto" w:val="clear"/>
+        </w:rPr>
       </w:r>
     </w:p>
     <w:p>
       <w:pPr>
         <w:pStyle w:val="Normal"/>
-        <w:rPr/>
-      </w:pPr>
-      <w:r>
-        <w:rPr/>
-        <w:t xml:space="preserve">O </w:t>
-      </w:r>
+        <w:rPr>
+          <w:shd w:fill="auto" w:val="clear"/>
+        </w:rPr>
+      </w:pPr>
+      <w:r>
+        <w:rPr>
+          <w:shd w:fill="auto" w:val="clear"/>
+        </w:rPr>
+        <w:t xml:space="preserve">Você deve desenvolver um serviço que recebe a identificação da conta corrente e retorne o </w:t>
+      </w:r>
+      <w:r>
+        <w:rPr>
+          <w:shd w:fill="auto" w:val="clear"/>
+        </w:rPr>
+        <w:t>saldo atual da conta</w:t>
+      </w:r>
+      <w:r>
+        <w:rPr>
+          <w:shd w:fill="auto" w:val="clear"/>
+        </w:rPr>
+        <w:t xml:space="preserve"> corrente.</w:t>
+      </w:r>
+    </w:p>
+    <w:p>
+      <w:pPr>
+        <w:pStyle w:val="Normal"/>
+        <w:rPr>
+          <w:shd w:fill="auto" w:val="clear"/>
+        </w:rPr>
+      </w:pPr>
+      <w:r>
+        <w:rPr>
+          <w:shd w:fill="auto" w:val="clear"/>
+        </w:rPr>
+      </w:r>
+    </w:p>
+    <w:p>
+      <w:pPr>
+        <w:pStyle w:val="Normal"/>
+        <w:rPr>
+          <w:shd w:fill="auto" w:val="clear"/>
+        </w:rPr>
+      </w:pPr>
+      <w:r>
+        <w:rPr>
+          <w:shd w:fill="auto" w:val="clear"/>
+        </w:rPr>
+        <w:t>Para calcular o saldo da conta corrente, a API deve contabilizar os movimentos persistidos até o momento.</w:t>
+      </w:r>
+    </w:p>
+    <w:p>
+      <w:pPr>
+        <w:pStyle w:val="Normal"/>
+        <w:rPr>
+          <w:shd w:fill="auto" w:val="clear"/>
+        </w:rPr>
+      </w:pPr>
+      <w:r>
+        <w:rPr>
+          <w:shd w:fill="auto" w:val="clear"/>
+        </w:rPr>
+      </w:r>
+    </w:p>
+    <w:p>
+      <w:pPr>
+        <w:pStyle w:val="Normal"/>
+        <w:rPr>
+          <w:shd w:fill="auto" w:val="clear"/>
+        </w:rPr>
+      </w:pPr>
       <w:r>
         <w:rPr>
           <w:b/>
           <w:bCs/>
-        </w:rPr>
-        <w:t>aplicativo</w:t>
-      </w:r>
-      <w:r>
-        <w:rPr/>
-        <w:t xml:space="preserve"> da empresa necessita exibir o saldo atual da conta corrente.</w:t>
+          <w:shd w:fill="auto" w:val="clear"/>
+        </w:rPr>
+        <w:t>Fórmula:</w:t>
       </w:r>
     </w:p>
     <w:p>
       <w:pPr>
         <w:pStyle w:val="Normal"/>
-        <w:rPr/>
-      </w:pPr>
-      <w:r>
-        <w:rPr/>
+        <w:rPr>
+          <w:shd w:fill="auto" w:val="clear"/>
+        </w:rPr>
+      </w:pPr>
+      <w:r>
+        <w:rPr>
+          <w:shd w:fill="auto" w:val="clear"/>
+        </w:rPr>
+        <w:t>SALDO = SOMA_DOS_CREDITOS – SOMA_DOS_DEBITOS</w:t>
       </w:r>
     </w:p>
     <w:p>
       <w:pPr>
         <w:pStyle w:val="Normal"/>
-        <w:rPr/>
-      </w:pPr>
-      <w:r>
-        <w:rPr/>
-        <w:t xml:space="preserve">Você deve desenvolver um serviço que recebe a identificação da conta corrente e retorne o </w:t>
-      </w:r>
-      <w:r>
-        <w:rPr>
-          <w:shd w:fill="FFFF00" w:val="clear"/>
-        </w:rPr>
-        <w:t>saldo atual da conta</w:t>
-      </w:r>
-      <w:r>
-        <w:rPr/>
-        <w:t xml:space="preserve"> corrente.</w:t>
+        <w:rPr>
+          <w:shd w:fill="auto" w:val="clear"/>
+        </w:rPr>
+      </w:pPr>
+      <w:r>
+        <w:rPr>
+          <w:shd w:fill="auto" w:val="clear"/>
+        </w:rPr>
       </w:r>
     </w:p>
     <w:p>
       <w:pPr>
         <w:pStyle w:val="Normal"/>
-        <w:rPr/>
-      </w:pPr>
-      <w:r>
-        <w:rPr/>
+        <w:rPr>
+          <w:shd w:fill="auto" w:val="clear"/>
+        </w:rPr>
+      </w:pPr>
+      <w:r>
+        <w:rPr>
+          <w:shd w:fill="auto" w:val="clear"/>
+        </w:rPr>
+        <w:t xml:space="preserve">Observação: </w:t>
+      </w:r>
+      <w:r>
+        <w:rPr>
+          <w:shd w:fill="auto" w:val="clear"/>
+        </w:rPr>
+        <w:t>Caso a conta não possua nenhuma movimentação, a API deve retornar o valor 0.00 (Zero)</w:t>
+      </w:r>
+      <w:r>
+        <w:rPr>
+          <w:shd w:fill="auto" w:val="clear"/>
+        </w:rPr>
+        <w:t>.</w:t>
       </w:r>
     </w:p>
     <w:p>
       <w:pPr>
         <w:pStyle w:val="Normal"/>
-        <w:rPr/>
-      </w:pPr>
-      <w:r>
-        <w:rPr/>
-        <w:t>Para calcular o saldo da conta corrente, a API deve contabilizar os movimentos persistidos até o momento.</w:t>
+        <w:rPr>
+          <w:shd w:fill="auto" w:val="clear"/>
+        </w:rPr>
+      </w:pPr>
+      <w:r>
+        <w:rPr>
+          <w:shd w:fill="auto" w:val="clear"/>
+        </w:rPr>
       </w:r>
     </w:p>
     <w:p>
       <w:pPr>
         <w:pStyle w:val="Normal"/>
-        <w:rPr/>
-      </w:pPr>
-      <w:r>
-        <w:rPr/>
-      </w:r>
-    </w:p>
-    <w:p>
-      <w:pPr>
-        <w:pStyle w:val="Normal"/>
-        <w:rPr>
-          <w:b/>
-          <w:b/>
-          <w:bCs/>
-        </w:rPr>
-      </w:pPr>
-      <w:r>
-        <w:rPr>
-          <w:b/>
-          <w:bCs/>
-        </w:rPr>
-        <w:t>Fórmula:</w:t>
-      </w:r>
-    </w:p>
-    <w:p>
-      <w:pPr>
-        <w:pStyle w:val="Normal"/>
-        <w:rPr>
-          <w:shd w:fill="FFFF00" w:val="clear"/>
-        </w:rPr>
-      </w:pPr>
-      <w:r>
-        <w:rPr>
-          <w:shd w:fill="FFFF00" w:val="clear"/>
-        </w:rPr>
-        <w:t>SALDO = SOMA_DOS_CREDITOS – SOMA_DOS_DEBITOS</w:t>
-      </w:r>
-    </w:p>
-    <w:p>
-      <w:pPr>
-        <w:pStyle w:val="Normal"/>
-        <w:rPr/>
-      </w:pPr>
-      <w:r>
-        <w:rPr/>
-      </w:r>
-    </w:p>
-    <w:p>
-      <w:pPr>
-        <w:pStyle w:val="Normal"/>
-        <w:rPr/>
-      </w:pPr>
-      <w:r>
-        <w:rPr/>
-        <w:t xml:space="preserve">Observação: </w:t>
-      </w:r>
-      <w:r>
-        <w:rPr>
-          <w:shd w:fill="FFFF00" w:val="clear"/>
-        </w:rPr>
-        <w:t>Caso a conta não possua nenhuma movimentação, a API deve retornar o valor 0.00 (Zero)</w:t>
-      </w:r>
-      <w:r>
-        <w:rPr/>
-        <w:t>.</w:t>
-      </w:r>
-    </w:p>
-    <w:p>
-      <w:pPr>
-        <w:pStyle w:val="Normal"/>
-        <w:rPr/>
-      </w:pPr>
-      <w:r>
-        <w:rPr/>
-      </w:r>
-    </w:p>
-    <w:p>
-      <w:pPr>
-        <w:pStyle w:val="Normal"/>
-        <w:rPr/>
-      </w:pPr>
-      <w:r>
-        <w:rPr/>
+        <w:rPr>
+          <w:shd w:fill="auto" w:val="clear"/>
+        </w:rPr>
+      </w:pPr>
+      <w:r>
+        <w:rPr>
+          <w:shd w:fill="auto" w:val="clear"/>
+        </w:rPr>
         <w:t>O serviço deve realizar as seguintes validações de negócio:</w:t>
       </w:r>
     </w:p>
@@ -4396,10 +4977,14 @@
           <w:ilvl w:val="0"/>
           <w:numId w:val="3"/>
         </w:numPr>
-        <w:rPr/>
-      </w:pPr>
-      <w:r>
-        <w:rPr/>
+        <w:rPr>
+          <w:shd w:fill="auto" w:val="clear"/>
+        </w:rPr>
+      </w:pPr>
+      <w:r>
+        <w:rPr>
+          <w:shd w:fill="auto" w:val="clear"/>
+        </w:rPr>
         <w:t>Apenas contas correntes cadastradas podem consultar o saldo; TIPO: INVALID_ACCOUNT.</w:t>
       </w:r>
     </w:p>
@@ -4410,29 +4995,41 @@
           <w:ilvl w:val="0"/>
           <w:numId w:val="3"/>
         </w:numPr>
-        <w:rPr/>
-      </w:pPr>
-      <w:r>
-        <w:rPr/>
+        <w:rPr>
+          <w:shd w:fill="auto" w:val="clear"/>
+        </w:rPr>
+      </w:pPr>
+      <w:r>
+        <w:rPr>
+          <w:shd w:fill="auto" w:val="clear"/>
+        </w:rPr>
         <w:t>Apenas contas correntes ativas podem consultar o saldo; TIPO: INACTIVE_ACCOUNT.</w:t>
       </w:r>
     </w:p>
     <w:p>
       <w:pPr>
         <w:pStyle w:val="Normal"/>
-        <w:rPr/>
-      </w:pPr>
-      <w:r>
-        <w:rPr/>
+        <w:rPr>
+          <w:shd w:fill="auto" w:val="clear"/>
+        </w:rPr>
+      </w:pPr>
+      <w:r>
+        <w:rPr>
+          <w:shd w:fill="auto" w:val="clear"/>
+        </w:rPr>
       </w:r>
     </w:p>
     <w:p>
       <w:pPr>
         <w:pStyle w:val="Normal"/>
-        <w:rPr/>
-      </w:pPr>
-      <w:r>
-        <w:rPr/>
+        <w:rPr>
+          <w:shd w:fill="auto" w:val="clear"/>
+        </w:rPr>
+      </w:pPr>
+      <w:r>
+        <w:rPr>
+          <w:shd w:fill="auto" w:val="clear"/>
+        </w:rPr>
         <w:t>Caso os dados sejam recebidos e estejam válidos, deve retornar HTTP 200 e retornar no body com os seguintes dados:</w:t>
       </w:r>
     </w:p>
@@ -4444,12 +5041,12 @@
           <w:numId w:val="4"/>
         </w:numPr>
         <w:rPr>
-          <w:shd w:fill="FFFF00" w:val="clear"/>
-        </w:rPr>
-      </w:pPr>
-      <w:r>
-        <w:rPr>
-          <w:shd w:fill="FFFF00" w:val="clear"/>
+          <w:shd w:fill="auto" w:val="clear"/>
+        </w:rPr>
+      </w:pPr>
+      <w:r>
+        <w:rPr>
+          <w:shd w:fill="auto" w:val="clear"/>
         </w:rPr>
         <w:t>Número da conta corrente</w:t>
       </w:r>
@@ -4462,12 +5059,12 @@
           <w:numId w:val="4"/>
         </w:numPr>
         <w:rPr>
-          <w:shd w:fill="FFFF00" w:val="clear"/>
-        </w:rPr>
-      </w:pPr>
-      <w:r>
-        <w:rPr>
-          <w:shd w:fill="FFFF00" w:val="clear"/>
+          <w:shd w:fill="auto" w:val="clear"/>
+        </w:rPr>
+      </w:pPr>
+      <w:r>
+        <w:rPr>
+          <w:shd w:fill="auto" w:val="clear"/>
         </w:rPr>
         <w:t>Nome do titular da conta corrente</w:t>
       </w:r>
@@ -4480,12 +5077,12 @@
           <w:numId w:val="4"/>
         </w:numPr>
         <w:rPr>
-          <w:shd w:fill="FFFF00" w:val="clear"/>
-        </w:rPr>
-      </w:pPr>
-      <w:r>
-        <w:rPr>
-          <w:shd w:fill="FFFF00" w:val="clear"/>
+          <w:shd w:fill="auto" w:val="clear"/>
+        </w:rPr>
+      </w:pPr>
+      <w:r>
+        <w:rPr>
+          <w:shd w:fill="auto" w:val="clear"/>
         </w:rPr>
         <w:t>Data e hora da resposta da consulta</w:t>
       </w:r>
@@ -4498,12 +5095,12 @@
           <w:numId w:val="4"/>
         </w:numPr>
         <w:rPr>
-          <w:shd w:fill="FFFF00" w:val="clear"/>
-        </w:rPr>
-      </w:pPr>
-      <w:r>
-        <w:rPr>
-          <w:shd w:fill="FFFF00" w:val="clear"/>
+          <w:shd w:fill="auto" w:val="clear"/>
+        </w:rPr>
+      </w:pPr>
+      <w:r>
+        <w:rPr>
+          <w:shd w:fill="auto" w:val="clear"/>
         </w:rPr>
         <w:t>Valor do Saldo atual</w:t>
       </w:r>
@@ -4511,93 +5108,117 @@
     <w:p>
       <w:pPr>
         <w:pStyle w:val="Normal"/>
-        <w:rPr/>
-      </w:pPr>
-      <w:r>
-        <w:rPr/>
+        <w:rPr>
+          <w:shd w:fill="auto" w:val="clear"/>
+        </w:rPr>
+      </w:pPr>
+      <w:r>
+        <w:rPr>
+          <w:shd w:fill="auto" w:val="clear"/>
+        </w:rPr>
       </w:r>
     </w:p>
     <w:p>
       <w:pPr>
         <w:pStyle w:val="Normal"/>
-        <w:rPr/>
-      </w:pPr>
-      <w:r>
-        <w:rPr/>
+        <w:rPr>
+          <w:shd w:fill="auto" w:val="clear"/>
+        </w:rPr>
+      </w:pPr>
+      <w:r>
+        <w:rPr>
+          <w:shd w:fill="auto" w:val="clear"/>
+        </w:rPr>
         <w:t xml:space="preserve">Caso os dados estejam inconsistentes, deve retornar falha </w:t>
       </w:r>
       <w:r>
         <w:rPr>
-          <w:shd w:fill="FFFF00" w:val="clear"/>
+          <w:shd w:fill="auto" w:val="clear"/>
         </w:rPr>
         <w:t>HTTP 400 (Bad Request)</w:t>
       </w:r>
       <w:r>
-        <w:rPr/>
+        <w:rPr>
+          <w:shd w:fill="auto" w:val="clear"/>
+        </w:rPr>
         <w:t xml:space="preserve"> e no body uma </w:t>
       </w:r>
       <w:r>
         <w:rPr>
-          <w:shd w:fill="FFFF00" w:val="clear"/>
-        </w:rPr>
-        <w:t xml:space="preserve">mensagem descritiva de qual foi a falha e o </w:t>
-      </w:r>
-      <w:r>
-        <w:rPr>
-          <w:shd w:fill="81D41A" w:val="clear"/>
-        </w:rPr>
-        <w:t>tipo de falha</w:t>
-      </w:r>
-      <w:r>
-        <w:rPr/>
+          <w:shd w:fill="auto" w:val="clear"/>
+        </w:rPr>
+        <w:t>mensagem descritiva de qual foi a falha e o tipo de falha</w:t>
+      </w:r>
+      <w:r>
+        <w:rPr>
+          <w:shd w:fill="auto" w:val="clear"/>
+        </w:rPr>
         <w:t>.</w:t>
       </w:r>
     </w:p>
     <w:p>
       <w:pPr>
         <w:pStyle w:val="Normal"/>
-        <w:rPr/>
-      </w:pPr>
-      <w:r>
-        <w:rPr/>
+        <w:rPr>
+          <w:shd w:fill="auto" w:val="clear"/>
+        </w:rPr>
+      </w:pPr>
+      <w:r>
+        <w:rPr>
+          <w:shd w:fill="auto" w:val="clear"/>
+        </w:rPr>
       </w:r>
     </w:p>
     <w:p>
       <w:pPr>
         <w:pStyle w:val="Normal"/>
-        <w:rPr/>
-      </w:pPr>
-      <w:r>
-        <w:rPr/>
+        <w:rPr>
+          <w:shd w:fill="auto" w:val="clear"/>
+        </w:rPr>
+      </w:pPr>
+      <w:r>
+        <w:rPr>
+          <w:shd w:fill="auto" w:val="clear"/>
+        </w:rPr>
       </w:r>
     </w:p>
     <w:p>
       <w:pPr>
         <w:pStyle w:val="Normal"/>
-        <w:rPr/>
-      </w:pPr>
-      <w:r>
-        <w:rPr/>
+        <w:rPr>
+          <w:shd w:fill="auto" w:val="clear"/>
+        </w:rPr>
+      </w:pPr>
+      <w:r>
+        <w:rPr>
+          <w:shd w:fill="auto" w:val="clear"/>
+        </w:rPr>
       </w:r>
     </w:p>
     <w:p>
       <w:pPr>
         <w:pStyle w:val="Normal"/>
-        <w:rPr/>
-      </w:pPr>
-      <w:r>
-        <w:rPr/>
+        <w:rPr>
+          <w:shd w:fill="auto" w:val="clear"/>
+        </w:rPr>
+      </w:pPr>
+      <w:r>
+        <w:rPr>
+          <w:shd w:fill="auto" w:val="clear"/>
+        </w:rPr>
       </w:r>
     </w:p>
     <w:p>
       <w:pPr>
         <w:pStyle w:val="Normal"/>
         <w:rPr>
-          <w:u w:val="single"/>
-        </w:rPr>
-      </w:pPr>
-      <w:r>
-        <w:rPr/>
+          <w:shd w:fill="auto" w:val="clear"/>
+        </w:rPr>
+      </w:pPr>
+      <w:r>
+        <w:rPr>
+          <w:shd w:fill="auto" w:val="clear"/>
+        </w:rPr>
       </w:r>
     </w:p>
     <w:sectPr>
@@ -5700,6 +6321,7 @@
     <w:qFormat/>
     <w:pPr>
       <w:widowControl/>
+      <w:suppressAutoHyphens w:val="true"/>
       <w:bidi w:val="0"/>
       <w:spacing w:before="0" w:after="0"/>
       <w:jc w:val="left"/>

</xml_diff>